<commit_message>
Communication of AI and REST for simulation
</commit_message>
<xml_diff>
--- a/07_Final_deliveries/Report/Report - Trade Hunter.docx
+++ b/07_Final_deliveries/Report/Report - Trade Hunter.docx
@@ -74,7 +74,7 @@
         <mc:AlternateContent>
           <mc:Choice Requires="wpg">
             <w:drawing>
-              <wp:anchor distT="0" distB="0" distL="114300" distR="114300" simplePos="0" relativeHeight="251659264" behindDoc="0" locked="0" layoutInCell="1" allowOverlap="1" wp14:anchorId="1E2ABBB2" wp14:editId="4521281B">
+              <wp:anchor distT="0" distB="0" distL="114300" distR="114300" simplePos="0" relativeHeight="251659264" behindDoc="0" locked="0" layoutInCell="1" allowOverlap="1" wp14:anchorId="1E2ABBB2" wp14:editId="2E40F4B9">
                 <wp:simplePos x="0" y="0"/>
                 <wp:positionH relativeFrom="column">
                   <wp:posOffset>-1714500</wp:posOffset>
@@ -931,7 +931,7 @@
         </w:rPr>
         <w:fldChar w:fldCharType="separate"/>
       </w:r>
-      <w:hyperlink w:anchor="_Toc156760723" w:history="1">
+      <w:hyperlink w:anchor="_Toc156844175" w:history="1">
         <w:r>
           <w:rPr>
             <w:rStyle w:val="Hipervnculo"/>
@@ -958,7 +958,7 @@
             <w:noProof/>
             <w:webHidden/>
           </w:rPr>
-          <w:instrText xml:space="preserve"> PAGEREF _Toc156760723 \h </w:instrText>
+          <w:instrText xml:space="preserve"> PAGEREF _Toc156844175 \h </w:instrText>
         </w:r>
         <w:r>
           <w:rPr>
@@ -1005,7 +1005,7 @@
           <w14:ligatures w14:val="standardContextual"/>
         </w:rPr>
       </w:pPr>
-      <w:hyperlink w:anchor="_Toc156760724" w:history="1">
+      <w:hyperlink w:anchor="_Toc156844176" w:history="1">
         <w:r>
           <w:rPr>
             <w:rStyle w:val="Hipervnculo"/>
@@ -1032,7 +1032,7 @@
             <w:noProof/>
             <w:webHidden/>
           </w:rPr>
-          <w:instrText xml:space="preserve"> PAGEREF _Toc156760724 \h </w:instrText>
+          <w:instrText xml:space="preserve"> PAGEREF _Toc156844176 \h </w:instrText>
         </w:r>
         <w:r>
           <w:rPr>
@@ -1080,7 +1080,7 @@
           <w14:ligatures w14:val="standardContextual"/>
         </w:rPr>
       </w:pPr>
-      <w:hyperlink w:anchor="_Toc156760725" w:history="1">
+      <w:hyperlink w:anchor="_Toc156844177" w:history="1">
         <w:r>
           <w:rPr>
             <w:rStyle w:val="Hipervnculo"/>
@@ -1126,7 +1126,7 @@
             <w:noProof/>
             <w:webHidden/>
           </w:rPr>
-          <w:instrText xml:space="preserve"> PAGEREF _Toc156760725 \h </w:instrText>
+          <w:instrText xml:space="preserve"> PAGEREF _Toc156844177 \h </w:instrText>
         </w:r>
         <w:r>
           <w:rPr>
@@ -1174,7 +1174,7 @@
           <w14:ligatures w14:val="standardContextual"/>
         </w:rPr>
       </w:pPr>
-      <w:hyperlink w:anchor="_Toc156760726" w:history="1">
+      <w:hyperlink w:anchor="_Toc156844178" w:history="1">
         <w:r>
           <w:rPr>
             <w:rStyle w:val="Hipervnculo"/>
@@ -1220,7 +1220,7 @@
             <w:noProof/>
             <w:webHidden/>
           </w:rPr>
-          <w:instrText xml:space="preserve"> PAGEREF _Toc156760726 \h </w:instrText>
+          <w:instrText xml:space="preserve"> PAGEREF _Toc156844178 \h </w:instrText>
         </w:r>
         <w:r>
           <w:rPr>
@@ -1268,7 +1268,7 @@
           <w14:ligatures w14:val="standardContextual"/>
         </w:rPr>
       </w:pPr>
-      <w:hyperlink w:anchor="_Toc156760727" w:history="1">
+      <w:hyperlink w:anchor="_Toc156844179" w:history="1">
         <w:r>
           <w:rPr>
             <w:rStyle w:val="Hipervnculo"/>
@@ -1314,7 +1314,7 @@
             <w:noProof/>
             <w:webHidden/>
           </w:rPr>
-          <w:instrText xml:space="preserve"> PAGEREF _Toc156760727 \h </w:instrText>
+          <w:instrText xml:space="preserve"> PAGEREF _Toc156844179 \h </w:instrText>
         </w:r>
         <w:r>
           <w:rPr>
@@ -1360,7 +1360,7 @@
           <w14:ligatures w14:val="standardContextual"/>
         </w:rPr>
       </w:pPr>
-      <w:hyperlink w:anchor="_Toc156760728" w:history="1">
+      <w:hyperlink w:anchor="_Toc156844180" w:history="1">
         <w:r>
           <w:rPr>
             <w:rStyle w:val="Hipervnculo"/>
@@ -1404,7 +1404,7 @@
             <w:noProof/>
             <w:webHidden/>
           </w:rPr>
-          <w:instrText xml:space="preserve"> PAGEREF _Toc156760728 \h </w:instrText>
+          <w:instrText xml:space="preserve"> PAGEREF _Toc156844180 \h </w:instrText>
         </w:r>
         <w:r>
           <w:rPr>
@@ -1450,7 +1450,7 @@
           <w14:ligatures w14:val="standardContextual"/>
         </w:rPr>
       </w:pPr>
-      <w:hyperlink w:anchor="_Toc156760729" w:history="1">
+      <w:hyperlink w:anchor="_Toc156844181" w:history="1">
         <w:r>
           <w:rPr>
             <w:rStyle w:val="Hipervnculo"/>
@@ -1494,7 +1494,7 @@
             <w:noProof/>
             <w:webHidden/>
           </w:rPr>
-          <w:instrText xml:space="preserve"> PAGEREF _Toc156760729 \h </w:instrText>
+          <w:instrText xml:space="preserve"> PAGEREF _Toc156844181 \h </w:instrText>
         </w:r>
         <w:r>
           <w:rPr>
@@ -1540,7 +1540,7 @@
           <w14:ligatures w14:val="standardContextual"/>
         </w:rPr>
       </w:pPr>
-      <w:hyperlink w:anchor="_Toc156760730" w:history="1">
+      <w:hyperlink w:anchor="_Toc156844182" w:history="1">
         <w:r>
           <w:rPr>
             <w:rStyle w:val="Hipervnculo"/>
@@ -1584,7 +1584,7 @@
             <w:noProof/>
             <w:webHidden/>
           </w:rPr>
-          <w:instrText xml:space="preserve"> PAGEREF _Toc156760730 \h </w:instrText>
+          <w:instrText xml:space="preserve"> PAGEREF _Toc156844182 \h </w:instrText>
         </w:r>
         <w:r>
           <w:rPr>
@@ -1630,7 +1630,7 @@
           <w14:ligatures w14:val="standardContextual"/>
         </w:rPr>
       </w:pPr>
-      <w:hyperlink w:anchor="_Toc156760731" w:history="1">
+      <w:hyperlink w:anchor="_Toc156844183" w:history="1">
         <w:r>
           <w:rPr>
             <w:rStyle w:val="Hipervnculo"/>
@@ -1674,7 +1674,7 @@
             <w:noProof/>
             <w:webHidden/>
           </w:rPr>
-          <w:instrText xml:space="preserve"> PAGEREF _Toc156760731 \h </w:instrText>
+          <w:instrText xml:space="preserve"> PAGEREF _Toc156844183 \h </w:instrText>
         </w:r>
         <w:r>
           <w:rPr>
@@ -1720,7 +1720,7 @@
           <w14:ligatures w14:val="standardContextual"/>
         </w:rPr>
       </w:pPr>
-      <w:hyperlink w:anchor="_Toc156760732" w:history="1">
+      <w:hyperlink w:anchor="_Toc156844184" w:history="1">
         <w:r>
           <w:rPr>
             <w:rStyle w:val="Hipervnculo"/>
@@ -1764,7 +1764,7 @@
             <w:noProof/>
             <w:webHidden/>
           </w:rPr>
-          <w:instrText xml:space="preserve"> PAGEREF _Toc156760732 \h </w:instrText>
+          <w:instrText xml:space="preserve"> PAGEREF _Toc156844184 \h </w:instrText>
         </w:r>
         <w:r>
           <w:rPr>
@@ -1810,7 +1810,7 @@
           <w14:ligatures w14:val="standardContextual"/>
         </w:rPr>
       </w:pPr>
-      <w:hyperlink w:anchor="_Toc156760733" w:history="1">
+      <w:hyperlink w:anchor="_Toc156844185" w:history="1">
         <w:r>
           <w:rPr>
             <w:rStyle w:val="Hipervnculo"/>
@@ -1854,7 +1854,7 @@
             <w:noProof/>
             <w:webHidden/>
           </w:rPr>
-          <w:instrText xml:space="preserve"> PAGEREF _Toc156760733 \h </w:instrText>
+          <w:instrText xml:space="preserve"> PAGEREF _Toc156844185 \h </w:instrText>
         </w:r>
         <w:r>
           <w:rPr>
@@ -1900,7 +1900,7 @@
           <w14:ligatures w14:val="standardContextual"/>
         </w:rPr>
       </w:pPr>
-      <w:hyperlink w:anchor="_Toc156760734" w:history="1">
+      <w:hyperlink w:anchor="_Toc156844186" w:history="1">
         <w:r>
           <w:rPr>
             <w:rStyle w:val="Hipervnculo"/>
@@ -1944,7 +1944,7 @@
             <w:noProof/>
             <w:webHidden/>
           </w:rPr>
-          <w:instrText xml:space="preserve"> PAGEREF _Toc156760734 \h </w:instrText>
+          <w:instrText xml:space="preserve"> PAGEREF _Toc156844186 \h </w:instrText>
         </w:r>
         <w:r>
           <w:rPr>
@@ -1990,7 +1990,7 @@
           <w14:ligatures w14:val="standardContextual"/>
         </w:rPr>
       </w:pPr>
-      <w:hyperlink w:anchor="_Toc156760735" w:history="1">
+      <w:hyperlink w:anchor="_Toc156844187" w:history="1">
         <w:r>
           <w:rPr>
             <w:rStyle w:val="Hipervnculo"/>
@@ -2034,7 +2034,7 @@
             <w:noProof/>
             <w:webHidden/>
           </w:rPr>
-          <w:instrText xml:space="preserve"> PAGEREF _Toc156760735 \h </w:instrText>
+          <w:instrText xml:space="preserve"> PAGEREF _Toc156844187 \h </w:instrText>
         </w:r>
         <w:r>
           <w:rPr>
@@ -2080,7 +2080,7 @@
           <w14:ligatures w14:val="standardContextual"/>
         </w:rPr>
       </w:pPr>
-      <w:hyperlink w:anchor="_Toc156760736" w:history="1">
+      <w:hyperlink w:anchor="_Toc156844188" w:history="1">
         <w:r>
           <w:rPr>
             <w:rStyle w:val="Hipervnculo"/>
@@ -2124,7 +2124,7 @@
             <w:noProof/>
             <w:webHidden/>
           </w:rPr>
-          <w:instrText xml:space="preserve"> PAGEREF _Toc156760736 \h </w:instrText>
+          <w:instrText xml:space="preserve"> PAGEREF _Toc156844188 \h </w:instrText>
         </w:r>
         <w:r>
           <w:rPr>
@@ -2170,7 +2170,7 @@
           <w14:ligatures w14:val="standardContextual"/>
         </w:rPr>
       </w:pPr>
-      <w:hyperlink w:anchor="_Toc156760737" w:history="1">
+      <w:hyperlink w:anchor="_Toc156844189" w:history="1">
         <w:r>
           <w:rPr>
             <w:rStyle w:val="Hipervnculo"/>
@@ -2214,7 +2214,7 @@
             <w:noProof/>
             <w:webHidden/>
           </w:rPr>
-          <w:instrText xml:space="preserve"> PAGEREF _Toc156760737 \h </w:instrText>
+          <w:instrText xml:space="preserve"> PAGEREF _Toc156844189 \h </w:instrText>
         </w:r>
         <w:r>
           <w:rPr>
@@ -2260,7 +2260,7 @@
           <w14:ligatures w14:val="standardContextual"/>
         </w:rPr>
       </w:pPr>
-      <w:hyperlink w:anchor="_Toc156760738" w:history="1">
+      <w:hyperlink w:anchor="_Toc156844190" w:history="1">
         <w:r>
           <w:rPr>
             <w:rStyle w:val="Hipervnculo"/>
@@ -2304,7 +2304,7 @@
             <w:noProof/>
             <w:webHidden/>
           </w:rPr>
-          <w:instrText xml:space="preserve"> PAGEREF _Toc156760738 \h </w:instrText>
+          <w:instrText xml:space="preserve"> PAGEREF _Toc156844190 \h </w:instrText>
         </w:r>
         <w:r>
           <w:rPr>
@@ -2350,7 +2350,7 @@
           <w14:ligatures w14:val="standardContextual"/>
         </w:rPr>
       </w:pPr>
-      <w:hyperlink w:anchor="_Toc156760739" w:history="1">
+      <w:hyperlink w:anchor="_Toc156844191" w:history="1">
         <w:r>
           <w:rPr>
             <w:rStyle w:val="Hipervnculo"/>
@@ -2394,7 +2394,7 @@
             <w:noProof/>
             <w:webHidden/>
           </w:rPr>
-          <w:instrText xml:space="preserve"> PAGEREF _Toc156760739 \h </w:instrText>
+          <w:instrText xml:space="preserve"> PAGEREF _Toc156844191 \h </w:instrText>
         </w:r>
         <w:r>
           <w:rPr>
@@ -2440,7 +2440,7 @@
           <w14:ligatures w14:val="standardContextual"/>
         </w:rPr>
       </w:pPr>
-      <w:hyperlink w:anchor="_Toc156760740" w:history="1">
+      <w:hyperlink w:anchor="_Toc156844192" w:history="1">
         <w:r>
           <w:rPr>
             <w:rStyle w:val="Hipervnculo"/>
@@ -2484,7 +2484,7 @@
             <w:noProof/>
             <w:webHidden/>
           </w:rPr>
-          <w:instrText xml:space="preserve"> PAGEREF _Toc156760740 \h </w:instrText>
+          <w:instrText xml:space="preserve"> PAGEREF _Toc156844192 \h </w:instrText>
         </w:r>
         <w:r>
           <w:rPr>
@@ -2530,7 +2530,7 @@
           <w14:ligatures w14:val="standardContextual"/>
         </w:rPr>
       </w:pPr>
-      <w:hyperlink w:anchor="_Toc156760741" w:history="1">
+      <w:hyperlink w:anchor="_Toc156844193" w:history="1">
         <w:r>
           <w:rPr>
             <w:rStyle w:val="Hipervnculo"/>
@@ -2574,7 +2574,7 @@
             <w:noProof/>
             <w:webHidden/>
           </w:rPr>
-          <w:instrText xml:space="preserve"> PAGEREF _Toc156760741 \h </w:instrText>
+          <w:instrText xml:space="preserve"> PAGEREF _Toc156844193 \h </w:instrText>
         </w:r>
         <w:r>
           <w:rPr>
@@ -2620,7 +2620,7 @@
           <w14:ligatures w14:val="standardContextual"/>
         </w:rPr>
       </w:pPr>
-      <w:hyperlink w:anchor="_Toc156760742" w:history="1">
+      <w:hyperlink w:anchor="_Toc156844194" w:history="1">
         <w:r>
           <w:rPr>
             <w:rStyle w:val="Hipervnculo"/>
@@ -2664,7 +2664,7 @@
             <w:noProof/>
             <w:webHidden/>
           </w:rPr>
-          <w:instrText xml:space="preserve"> PAGEREF _Toc156760742 \h </w:instrText>
+          <w:instrText xml:space="preserve"> PAGEREF _Toc156844194 \h </w:instrText>
         </w:r>
         <w:r>
           <w:rPr>
@@ -2710,7 +2710,7 @@
           <w14:ligatures w14:val="standardContextual"/>
         </w:rPr>
       </w:pPr>
-      <w:hyperlink w:anchor="_Toc156760743" w:history="1">
+      <w:hyperlink w:anchor="_Toc156844195" w:history="1">
         <w:r>
           <w:rPr>
             <w:rStyle w:val="Hipervnculo"/>
@@ -2754,7 +2754,7 @@
             <w:noProof/>
             <w:webHidden/>
           </w:rPr>
-          <w:instrText xml:space="preserve"> PAGEREF _Toc156760743 \h </w:instrText>
+          <w:instrText xml:space="preserve"> PAGEREF _Toc156844195 \h </w:instrText>
         </w:r>
         <w:r>
           <w:rPr>
@@ -2800,7 +2800,7 @@
           <w14:ligatures w14:val="standardContextual"/>
         </w:rPr>
       </w:pPr>
-      <w:hyperlink w:anchor="_Toc156760744" w:history="1">
+      <w:hyperlink w:anchor="_Toc156844196" w:history="1">
         <w:r>
           <w:rPr>
             <w:rStyle w:val="Hipervnculo"/>
@@ -2844,7 +2844,7 @@
             <w:noProof/>
             <w:webHidden/>
           </w:rPr>
-          <w:instrText xml:space="preserve"> PAGEREF _Toc156760744 \h </w:instrText>
+          <w:instrText xml:space="preserve"> PAGEREF _Toc156844196 \h </w:instrText>
         </w:r>
         <w:r>
           <w:rPr>
@@ -2890,7 +2890,7 @@
           <w14:ligatures w14:val="standardContextual"/>
         </w:rPr>
       </w:pPr>
-      <w:hyperlink w:anchor="_Toc156760745" w:history="1">
+      <w:hyperlink w:anchor="_Toc156844197" w:history="1">
         <w:r>
           <w:rPr>
             <w:rStyle w:val="Hipervnculo"/>
@@ -2934,7 +2934,7 @@
             <w:noProof/>
             <w:webHidden/>
           </w:rPr>
-          <w:instrText xml:space="preserve"> PAGEREF _Toc156760745 \h </w:instrText>
+          <w:instrText xml:space="preserve"> PAGEREF _Toc156844197 \h </w:instrText>
         </w:r>
         <w:r>
           <w:rPr>
@@ -2980,7 +2980,7 @@
           <w14:ligatures w14:val="standardContextual"/>
         </w:rPr>
       </w:pPr>
-      <w:hyperlink w:anchor="_Toc156760746" w:history="1">
+      <w:hyperlink w:anchor="_Toc156844198" w:history="1">
         <w:r>
           <w:rPr>
             <w:rStyle w:val="Hipervnculo"/>
@@ -3024,7 +3024,7 @@
             <w:noProof/>
             <w:webHidden/>
           </w:rPr>
-          <w:instrText xml:space="preserve"> PAGEREF _Toc156760746 \h </w:instrText>
+          <w:instrText xml:space="preserve"> PAGEREF _Toc156844198 \h </w:instrText>
         </w:r>
         <w:r>
           <w:rPr>
@@ -3070,7 +3070,7 @@
           <w14:ligatures w14:val="standardContextual"/>
         </w:rPr>
       </w:pPr>
-      <w:hyperlink w:anchor="_Toc156760747" w:history="1">
+      <w:hyperlink w:anchor="_Toc156844199" w:history="1">
         <w:r>
           <w:rPr>
             <w:rStyle w:val="Hipervnculo"/>
@@ -3114,7 +3114,7 @@
             <w:noProof/>
             <w:webHidden/>
           </w:rPr>
-          <w:instrText xml:space="preserve"> PAGEREF _Toc156760747 \h </w:instrText>
+          <w:instrText xml:space="preserve"> PAGEREF _Toc156844199 \h </w:instrText>
         </w:r>
         <w:r>
           <w:rPr>
@@ -3162,7 +3162,7 @@
           <w14:ligatures w14:val="standardContextual"/>
         </w:rPr>
       </w:pPr>
-      <w:hyperlink w:anchor="_Toc156760748" w:history="1">
+      <w:hyperlink w:anchor="_Toc156844200" w:history="1">
         <w:r>
           <w:rPr>
             <w:rStyle w:val="Hipervnculo"/>
@@ -3208,7 +3208,7 @@
             <w:noProof/>
             <w:webHidden/>
           </w:rPr>
-          <w:instrText xml:space="preserve"> PAGEREF _Toc156760748 \h </w:instrText>
+          <w:instrText xml:space="preserve"> PAGEREF _Toc156844200 \h </w:instrText>
         </w:r>
         <w:r>
           <w:rPr>
@@ -3254,7 +3254,7 @@
           <w14:ligatures w14:val="standardContextual"/>
         </w:rPr>
       </w:pPr>
-      <w:hyperlink w:anchor="_Toc156760749" w:history="1">
+      <w:hyperlink w:anchor="_Toc156844201" w:history="1">
         <w:r>
           <w:rPr>
             <w:rStyle w:val="Hipervnculo"/>
@@ -3298,7 +3298,7 @@
             <w:noProof/>
             <w:webHidden/>
           </w:rPr>
-          <w:instrText xml:space="preserve"> PAGEREF _Toc156760749 \h </w:instrText>
+          <w:instrText xml:space="preserve"> PAGEREF _Toc156844201 \h </w:instrText>
         </w:r>
         <w:r>
           <w:rPr>
@@ -3344,7 +3344,7 @@
           <w14:ligatures w14:val="standardContextual"/>
         </w:rPr>
       </w:pPr>
-      <w:hyperlink w:anchor="_Toc156760750" w:history="1">
+      <w:hyperlink w:anchor="_Toc156844202" w:history="1">
         <w:r>
           <w:rPr>
             <w:rStyle w:val="Hipervnculo"/>
@@ -3388,7 +3388,7 @@
             <w:noProof/>
             <w:webHidden/>
           </w:rPr>
-          <w:instrText xml:space="preserve"> PAGEREF _Toc156760750 \h </w:instrText>
+          <w:instrText xml:space="preserve"> PAGEREF _Toc156844202 \h </w:instrText>
         </w:r>
         <w:r>
           <w:rPr>
@@ -3408,7 +3408,7 @@
             <w:noProof/>
             <w:webHidden/>
           </w:rPr>
-          <w:t>19</w:t>
+          <w:t>20</w:t>
         </w:r>
         <w:r>
           <w:rPr>
@@ -3434,7 +3434,7 @@
           <w14:ligatures w14:val="standardContextual"/>
         </w:rPr>
       </w:pPr>
-      <w:hyperlink w:anchor="_Toc156760751" w:history="1">
+      <w:hyperlink w:anchor="_Toc156844203" w:history="1">
         <w:r>
           <w:rPr>
             <w:rStyle w:val="Hipervnculo"/>
@@ -3478,7 +3478,7 @@
             <w:noProof/>
             <w:webHidden/>
           </w:rPr>
-          <w:instrText xml:space="preserve"> PAGEREF _Toc156760751 \h </w:instrText>
+          <w:instrText xml:space="preserve"> PAGEREF _Toc156844203 \h </w:instrText>
         </w:r>
         <w:r>
           <w:rPr>
@@ -3524,7 +3524,7 @@
           <w14:ligatures w14:val="standardContextual"/>
         </w:rPr>
       </w:pPr>
-      <w:hyperlink w:anchor="_Toc156760752" w:history="1">
+      <w:hyperlink w:anchor="_Toc156844204" w:history="1">
         <w:r>
           <w:rPr>
             <w:rStyle w:val="Hipervnculo"/>
@@ -3568,7 +3568,7 @@
             <w:noProof/>
             <w:webHidden/>
           </w:rPr>
-          <w:instrText xml:space="preserve"> PAGEREF _Toc156760752 \h </w:instrText>
+          <w:instrText xml:space="preserve"> PAGEREF _Toc156844204 \h </w:instrText>
         </w:r>
         <w:r>
           <w:rPr>
@@ -3616,7 +3616,7 @@
           <w14:ligatures w14:val="standardContextual"/>
         </w:rPr>
       </w:pPr>
-      <w:hyperlink w:anchor="_Toc156760753" w:history="1">
+      <w:hyperlink w:anchor="_Toc156844205" w:history="1">
         <w:r>
           <w:rPr>
             <w:rStyle w:val="Hipervnculo"/>
@@ -3662,7 +3662,7 @@
             <w:noProof/>
             <w:webHidden/>
           </w:rPr>
-          <w:instrText xml:space="preserve"> PAGEREF _Toc156760753 \h </w:instrText>
+          <w:instrText xml:space="preserve"> PAGEREF _Toc156844205 \h </w:instrText>
         </w:r>
         <w:r>
           <w:rPr>
@@ -3682,7 +3682,7 @@
             <w:noProof/>
             <w:webHidden/>
           </w:rPr>
-          <w:t>22</w:t>
+          <w:t>23</w:t>
         </w:r>
         <w:r>
           <w:rPr>
@@ -3708,7 +3708,7 @@
           <w14:ligatures w14:val="standardContextual"/>
         </w:rPr>
       </w:pPr>
-      <w:hyperlink w:anchor="_Toc156760754" w:history="1">
+      <w:hyperlink w:anchor="_Toc156844206" w:history="1">
         <w:r>
           <w:rPr>
             <w:rStyle w:val="Hipervnculo"/>
@@ -3752,7 +3752,7 @@
             <w:noProof/>
             <w:webHidden/>
           </w:rPr>
-          <w:instrText xml:space="preserve"> PAGEREF _Toc156760754 \h </w:instrText>
+          <w:instrText xml:space="preserve"> PAGEREF _Toc156844206 \h </w:instrText>
         </w:r>
         <w:r>
           <w:rPr>
@@ -3772,7 +3772,7 @@
             <w:noProof/>
             <w:webHidden/>
           </w:rPr>
-          <w:t>22</w:t>
+          <w:t>23</w:t>
         </w:r>
         <w:r>
           <w:rPr>
@@ -3798,7 +3798,7 @@
           <w14:ligatures w14:val="standardContextual"/>
         </w:rPr>
       </w:pPr>
-      <w:hyperlink w:anchor="_Toc156760755" w:history="1">
+      <w:hyperlink w:anchor="_Toc156844207" w:history="1">
         <w:r>
           <w:rPr>
             <w:rStyle w:val="Hipervnculo"/>
@@ -3842,7 +3842,7 @@
             <w:noProof/>
             <w:webHidden/>
           </w:rPr>
-          <w:instrText xml:space="preserve"> PAGEREF _Toc156760755 \h </w:instrText>
+          <w:instrText xml:space="preserve"> PAGEREF _Toc156844207 \h </w:instrText>
         </w:r>
         <w:r>
           <w:rPr>
@@ -3862,7 +3862,7 @@
             <w:noProof/>
             <w:webHidden/>
           </w:rPr>
-          <w:t>22</w:t>
+          <w:t>23</w:t>
         </w:r>
         <w:r>
           <w:rPr>
@@ -3890,7 +3890,7 @@
           <w14:ligatures w14:val="standardContextual"/>
         </w:rPr>
       </w:pPr>
-      <w:hyperlink w:anchor="_Toc156760756" w:history="1">
+      <w:hyperlink w:anchor="_Toc156844208" w:history="1">
         <w:r>
           <w:rPr>
             <w:rStyle w:val="Hipervnculo"/>
@@ -3936,7 +3936,7 @@
             <w:noProof/>
             <w:webHidden/>
           </w:rPr>
-          <w:instrText xml:space="preserve"> PAGEREF _Toc156760756 \h </w:instrText>
+          <w:instrText xml:space="preserve"> PAGEREF _Toc156844208 \h </w:instrText>
         </w:r>
         <w:r>
           <w:rPr>
@@ -3956,7 +3956,7 @@
             <w:noProof/>
             <w:webHidden/>
           </w:rPr>
-          <w:t>23</w:t>
+          <w:t>24</w:t>
         </w:r>
         <w:r>
           <w:rPr>
@@ -3984,7 +3984,7 @@
           <w14:ligatures w14:val="standardContextual"/>
         </w:rPr>
       </w:pPr>
-      <w:hyperlink w:anchor="_Toc156760757" w:history="1">
+      <w:hyperlink w:anchor="_Toc156844209" w:history="1">
         <w:r>
           <w:rPr>
             <w:rStyle w:val="Hipervnculo"/>
@@ -4030,7 +4030,7 @@
             <w:noProof/>
             <w:webHidden/>
           </w:rPr>
-          <w:instrText xml:space="preserve"> PAGEREF _Toc156760757 \h </w:instrText>
+          <w:instrText xml:space="preserve"> PAGEREF _Toc156844209 \h </w:instrText>
         </w:r>
         <w:r>
           <w:rPr>
@@ -4050,7 +4050,7 @@
             <w:noProof/>
             <w:webHidden/>
           </w:rPr>
-          <w:t>24</w:t>
+          <w:t>25</w:t>
         </w:r>
         <w:r>
           <w:rPr>
@@ -4095,7 +4095,7 @@
           <w:numId w:val="0"/>
         </w:numPr>
       </w:pPr>
-      <w:bookmarkStart w:id="2" w:name="_Toc156760723"/>
+      <w:bookmarkStart w:id="2" w:name="_Toc156844175"/>
       <w:r>
         <w:lastRenderedPageBreak/>
         <w:t>Figure index</w:t>
@@ -4122,7 +4122,7 @@
       <w:r>
         <w:fldChar w:fldCharType="separate"/>
       </w:r>
-      <w:hyperlink w:anchor="_Toc156760794" w:history="1">
+      <w:hyperlink w:anchor="_Toc156844210" w:history="1">
         <w:r>
           <w:rPr>
             <w:rStyle w:val="Hipervnculo"/>
@@ -4157,7 +4157,7 @@
             <w:noProof/>
             <w:webHidden/>
           </w:rPr>
-          <w:instrText xml:space="preserve"> PAGEREF _Toc156760794 \h </w:instrText>
+          <w:instrText xml:space="preserve"> PAGEREF _Toc156844210 \h </w:instrText>
         </w:r>
         <w:r>
           <w:rPr>
@@ -4199,7 +4199,7 @@
           <w14:ligatures w14:val="standardContextual"/>
         </w:rPr>
       </w:pPr>
-      <w:hyperlink w:anchor="_Toc156760795" w:history="1">
+      <w:hyperlink w:anchor="_Toc156844211" w:history="1">
         <w:r>
           <w:rPr>
             <w:rStyle w:val="Hipervnculo"/>
@@ -4234,7 +4234,7 @@
             <w:noProof/>
             <w:webHidden/>
           </w:rPr>
-          <w:instrText xml:space="preserve"> PAGEREF _Toc156760795 \h </w:instrText>
+          <w:instrText xml:space="preserve"> PAGEREF _Toc156844211 \h </w:instrText>
         </w:r>
         <w:r>
           <w:rPr>
@@ -4276,7 +4276,7 @@
           <w14:ligatures w14:val="standardContextual"/>
         </w:rPr>
       </w:pPr>
-      <w:hyperlink w:anchor="_Toc156760796" w:history="1">
+      <w:hyperlink w:anchor="_Toc156844212" w:history="1">
         <w:r>
           <w:rPr>
             <w:rStyle w:val="Hipervnculo"/>
@@ -4311,7 +4311,7 @@
             <w:noProof/>
             <w:webHidden/>
           </w:rPr>
-          <w:instrText xml:space="preserve"> PAGEREF _Toc156760796 \h </w:instrText>
+          <w:instrText xml:space="preserve"> PAGEREF _Toc156844212 \h </w:instrText>
         </w:r>
         <w:r>
           <w:rPr>
@@ -4353,7 +4353,7 @@
           <w14:ligatures w14:val="standardContextual"/>
         </w:rPr>
       </w:pPr>
-      <w:hyperlink w:anchor="_Toc156760797" w:history="1">
+      <w:hyperlink w:anchor="_Toc156844213" w:history="1">
         <w:r>
           <w:rPr>
             <w:rStyle w:val="Hipervnculo"/>
@@ -4388,7 +4388,7 @@
             <w:noProof/>
             <w:webHidden/>
           </w:rPr>
-          <w:instrText xml:space="preserve"> PAGEREF _Toc156760797 \h </w:instrText>
+          <w:instrText xml:space="preserve"> PAGEREF _Toc156844213 \h </w:instrText>
         </w:r>
         <w:r>
           <w:rPr>
@@ -4430,7 +4430,7 @@
           <w14:ligatures w14:val="standardContextual"/>
         </w:rPr>
       </w:pPr>
-      <w:hyperlink w:anchor="_Toc156760798" w:history="1">
+      <w:hyperlink w:anchor="_Toc156844214" w:history="1">
         <w:r>
           <w:rPr>
             <w:rStyle w:val="Hipervnculo"/>
@@ -4465,7 +4465,7 @@
             <w:noProof/>
             <w:webHidden/>
           </w:rPr>
-          <w:instrText xml:space="preserve"> PAGEREF _Toc156760798 \h </w:instrText>
+          <w:instrText xml:space="preserve"> PAGEREF _Toc156844214 \h </w:instrText>
         </w:r>
         <w:r>
           <w:rPr>
@@ -4507,7 +4507,7 @@
           <w14:ligatures w14:val="standardContextual"/>
         </w:rPr>
       </w:pPr>
-      <w:hyperlink w:anchor="_Toc156760799" w:history="1">
+      <w:hyperlink w:anchor="_Toc156844215" w:history="1">
         <w:r>
           <w:rPr>
             <w:rStyle w:val="Hipervnculo"/>
@@ -4542,7 +4542,7 @@
             <w:noProof/>
             <w:webHidden/>
           </w:rPr>
-          <w:instrText xml:space="preserve"> PAGEREF _Toc156760799 \h </w:instrText>
+          <w:instrText xml:space="preserve"> PAGEREF _Toc156844215 \h </w:instrText>
         </w:r>
         <w:r>
           <w:rPr>
@@ -4584,7 +4584,7 @@
           <w14:ligatures w14:val="standardContextual"/>
         </w:rPr>
       </w:pPr>
-      <w:hyperlink w:anchor="_Toc156760800" w:history="1">
+      <w:hyperlink w:anchor="_Toc156844216" w:history="1">
         <w:r>
           <w:rPr>
             <w:rStyle w:val="Hipervnculo"/>
@@ -4619,7 +4619,7 @@
             <w:noProof/>
             <w:webHidden/>
           </w:rPr>
-          <w:instrText xml:space="preserve"> PAGEREF _Toc156760800 \h </w:instrText>
+          <w:instrText xml:space="preserve"> PAGEREF _Toc156844216 \h </w:instrText>
         </w:r>
         <w:r>
           <w:rPr>
@@ -4661,7 +4661,7 @@
           <w14:ligatures w14:val="standardContextual"/>
         </w:rPr>
       </w:pPr>
-      <w:hyperlink w:anchor="_Toc156760801" w:history="1">
+      <w:hyperlink w:anchor="_Toc156844217" w:history="1">
         <w:r>
           <w:rPr>
             <w:rStyle w:val="Hipervnculo"/>
@@ -4696,7 +4696,7 @@
             <w:noProof/>
             <w:webHidden/>
           </w:rPr>
-          <w:instrText xml:space="preserve"> PAGEREF _Toc156760801 \h </w:instrText>
+          <w:instrText xml:space="preserve"> PAGEREF _Toc156844217 \h </w:instrText>
         </w:r>
         <w:r>
           <w:rPr>
@@ -4738,7 +4738,7 @@
           <w14:ligatures w14:val="standardContextual"/>
         </w:rPr>
       </w:pPr>
-      <w:hyperlink w:anchor="_Toc156760802" w:history="1">
+      <w:hyperlink w:anchor="_Toc156844218" w:history="1">
         <w:r>
           <w:rPr>
             <w:rStyle w:val="Hipervnculo"/>
@@ -4773,7 +4773,7 @@
             <w:noProof/>
             <w:webHidden/>
           </w:rPr>
-          <w:instrText xml:space="preserve"> PAGEREF _Toc156760802 \h </w:instrText>
+          <w:instrText xml:space="preserve"> PAGEREF _Toc156844218 \h </w:instrText>
         </w:r>
         <w:r>
           <w:rPr>
@@ -4794,6 +4794,160 @@
             <w:webHidden/>
           </w:rPr>
           <w:t>17</w:t>
+        </w:r>
+        <w:r>
+          <w:rPr>
+            <w:noProof/>
+            <w:webHidden/>
+          </w:rPr>
+          <w:fldChar w:fldCharType="end"/>
+        </w:r>
+      </w:hyperlink>
+    </w:p>
+    <w:p>
+      <w:pPr>
+        <w:pStyle w:val="Tabladeilustraciones"/>
+        <w:rPr>
+          <w:rFonts w:asciiTheme="minorHAnsi" w:eastAsiaTheme="minorEastAsia" w:hAnsiTheme="minorHAnsi"/>
+          <w:noProof/>
+          <w:kern w:val="2"/>
+          <w:lang w:val="eu-ES" w:eastAsia="eu-ES"/>
+          <w14:ligatures w14:val="standardContextual"/>
+        </w:rPr>
+      </w:pPr>
+      <w:hyperlink w:anchor="_Toc156844219" w:history="1">
+        <w:r>
+          <w:rPr>
+            <w:rStyle w:val="Hipervnculo"/>
+            <w:noProof/>
+          </w:rPr>
+          <w:t>4</w:t>
+        </w:r>
+        <w:r>
+          <w:rPr>
+            <w:rStyle w:val="Hipervnculo"/>
+            <w:noProof/>
+          </w:rPr>
+          <w:noBreakHyphen/>
+          <w:t>1. Figure: Project's final Gantt chart</w:t>
+        </w:r>
+        <w:r>
+          <w:rPr>
+            <w:noProof/>
+            <w:webHidden/>
+          </w:rPr>
+          <w:tab/>
+        </w:r>
+        <w:r>
+          <w:rPr>
+            <w:noProof/>
+            <w:webHidden/>
+          </w:rPr>
+          <w:fldChar w:fldCharType="begin"/>
+        </w:r>
+        <w:r>
+          <w:rPr>
+            <w:noProof/>
+            <w:webHidden/>
+          </w:rPr>
+          <w:instrText xml:space="preserve"> PAGEREF _Toc156844219 \h </w:instrText>
+        </w:r>
+        <w:r>
+          <w:rPr>
+            <w:noProof/>
+            <w:webHidden/>
+          </w:rPr>
+        </w:r>
+        <w:r>
+          <w:rPr>
+            <w:noProof/>
+            <w:webHidden/>
+          </w:rPr>
+          <w:fldChar w:fldCharType="separate"/>
+        </w:r>
+        <w:r>
+          <w:rPr>
+            <w:noProof/>
+            <w:webHidden/>
+          </w:rPr>
+          <w:t>20</w:t>
+        </w:r>
+        <w:r>
+          <w:rPr>
+            <w:noProof/>
+            <w:webHidden/>
+          </w:rPr>
+          <w:fldChar w:fldCharType="end"/>
+        </w:r>
+      </w:hyperlink>
+    </w:p>
+    <w:p>
+      <w:pPr>
+        <w:pStyle w:val="Tabladeilustraciones"/>
+        <w:rPr>
+          <w:rFonts w:asciiTheme="minorHAnsi" w:eastAsiaTheme="minorEastAsia" w:hAnsiTheme="minorHAnsi"/>
+          <w:noProof/>
+          <w:kern w:val="2"/>
+          <w:lang w:val="eu-ES" w:eastAsia="eu-ES"/>
+          <w14:ligatures w14:val="standardContextual"/>
+        </w:rPr>
+      </w:pPr>
+      <w:hyperlink w:anchor="_Toc156844220" w:history="1">
+        <w:r>
+          <w:rPr>
+            <w:rStyle w:val="Hipervnculo"/>
+            <w:noProof/>
+          </w:rPr>
+          <w:t>4</w:t>
+        </w:r>
+        <w:r>
+          <w:rPr>
+            <w:rStyle w:val="Hipervnculo"/>
+            <w:noProof/>
+          </w:rPr>
+          <w:noBreakHyphen/>
+          <w:t>2. Figure: SDG alignment evaluation summary</w:t>
+        </w:r>
+        <w:r>
+          <w:rPr>
+            <w:noProof/>
+            <w:webHidden/>
+          </w:rPr>
+          <w:tab/>
+        </w:r>
+        <w:r>
+          <w:rPr>
+            <w:noProof/>
+            <w:webHidden/>
+          </w:rPr>
+          <w:fldChar w:fldCharType="begin"/>
+        </w:r>
+        <w:r>
+          <w:rPr>
+            <w:noProof/>
+            <w:webHidden/>
+          </w:rPr>
+          <w:instrText xml:space="preserve"> PAGEREF _Toc156844220 \h </w:instrText>
+        </w:r>
+        <w:r>
+          <w:rPr>
+            <w:noProof/>
+            <w:webHidden/>
+          </w:rPr>
+        </w:r>
+        <w:r>
+          <w:rPr>
+            <w:noProof/>
+            <w:webHidden/>
+          </w:rPr>
+          <w:fldChar w:fldCharType="separate"/>
+        </w:r>
+        <w:r>
+          <w:rPr>
+            <w:noProof/>
+            <w:webHidden/>
+          </w:rPr>
+          <w:t>22</w:t>
         </w:r>
         <w:r>
           <w:rPr>
@@ -4827,7 +4981,7 @@
           <w:numId w:val="0"/>
         </w:numPr>
       </w:pPr>
-      <w:bookmarkStart w:id="3" w:name="_Toc156760724"/>
+      <w:bookmarkStart w:id="3" w:name="_Toc156844176"/>
       <w:r>
         <w:lastRenderedPageBreak/>
         <w:t>Table index</w:t>
@@ -4863,7 +5017,7 @@
         </w:rPr>
         <w:fldChar w:fldCharType="separate"/>
       </w:r>
-      <w:hyperlink w:anchor="_Toc156760803" w:history="1">
+      <w:hyperlink w:anchor="_Toc156844221" w:history="1">
         <w:r>
           <w:rPr>
             <w:rStyle w:val="Hipervnculo"/>
@@ -4898,7 +5052,7 @@
             <w:noProof/>
             <w:webHidden/>
           </w:rPr>
-          <w:instrText xml:space="preserve"> PAGEREF _Toc156760803 \h </w:instrText>
+          <w:instrText xml:space="preserve"> PAGEREF _Toc156844221 \h </w:instrText>
         </w:r>
         <w:r>
           <w:rPr>
@@ -4918,7 +5072,7 @@
             <w:noProof/>
             <w:webHidden/>
           </w:rPr>
-          <w:t>20</w:t>
+          <w:t>21</w:t>
         </w:r>
         <w:r>
           <w:rPr>
@@ -4965,7 +5119,7 @@
       <w:pPr>
         <w:pStyle w:val="Ttulo1"/>
       </w:pPr>
-      <w:bookmarkStart w:id="4" w:name="_Toc156760725"/>
+      <w:bookmarkStart w:id="4" w:name="_Toc156844177"/>
       <w:r>
         <w:lastRenderedPageBreak/>
         <w:t>Introduction</w:t>
@@ -5478,7 +5632,7 @@
         <w:pStyle w:val="Ttulo1"/>
       </w:pPr>
       <w:bookmarkStart w:id="5" w:name="_Toc86850233"/>
-      <w:bookmarkStart w:id="6" w:name="_Toc156760726"/>
+      <w:bookmarkStart w:id="6" w:name="_Toc156844178"/>
       <w:r>
         <w:lastRenderedPageBreak/>
         <w:t>Planification</w:t>
@@ -5516,13 +5670,7 @@
         <w:t>1</w:t>
       </w:r>
       <w:r>
-        <w:t>. Annex: Project's in</w:t>
-      </w:r>
-      <w:r>
-        <w:t>i</w:t>
-      </w:r>
-      <w:r>
-        <w:t>tial planning</w:t>
+        <w:t>. Annex: Project's initial planning</w:t>
       </w:r>
       <w:r>
         <w:fldChar w:fldCharType="end"/>
@@ -5602,7 +5750,7 @@
         </w:rPr>
         <w:lastRenderedPageBreak/>
         <w:drawing>
-          <wp:inline distT="0" distB="0" distL="0" distR="0" wp14:anchorId="0CA512F2" wp14:editId="1F98D49C">
+          <wp:inline distT="0" distB="0" distL="0" distR="0" wp14:anchorId="0CA512F2" wp14:editId="16F41E74">
             <wp:extent cx="5731510" cy="2495550"/>
             <wp:effectExtent l="0" t="0" r="2540" b="0"/>
             <wp:docPr id="1259540523" name="Imagen 1" descr="Escala de tiempo&#10;&#10;Descripción generada automáticamente"/>
@@ -5676,7 +5824,7 @@
       <w:r>
         <w:fldChar w:fldCharType="separate"/>
       </w:r>
-      <w:bookmarkStart w:id="8" w:name="_Toc156760794"/>
+      <w:bookmarkStart w:id="8" w:name="_Toc156844210"/>
       <w:r>
         <w:rPr>
           <w:noProof/>
@@ -5717,7 +5865,7 @@
       <w:pPr>
         <w:pStyle w:val="Ttulo1"/>
       </w:pPr>
-      <w:bookmarkStart w:id="9" w:name="_Toc156760727"/>
+      <w:bookmarkStart w:id="9" w:name="_Toc156844179"/>
       <w:bookmarkEnd w:id="5"/>
       <w:r>
         <w:lastRenderedPageBreak/>
@@ -5740,7 +5888,7 @@
       <w:pPr>
         <w:pStyle w:val="Ttulo2"/>
       </w:pPr>
-      <w:bookmarkStart w:id="10" w:name="_Toc156760728"/>
+      <w:bookmarkStart w:id="10" w:name="_Toc156844180"/>
       <w:r>
         <w:t>Description of the whole product</w:t>
       </w:r>
@@ -5770,7 +5918,7 @@
       <w:pPr>
         <w:pStyle w:val="Ttulo3"/>
       </w:pPr>
-      <w:bookmarkStart w:id="11" w:name="_Toc156760729"/>
+      <w:bookmarkStart w:id="11" w:name="_Toc156844181"/>
       <w:r>
         <w:t>Structure of the product</w:t>
       </w:r>
@@ -5814,25 +5962,13 @@
         <w:fldChar w:fldCharType="end"/>
       </w:r>
       <w:r>
-        <w:t xml:space="preserve">), application users connect to the client and interact with the web page to ask for a forecast or to look at information about different stock market movements. The website connects to the web server where all the controllers are located. This is the </w:t>
-      </w:r>
-      <w:r>
-        <w:t>centre</w:t>
-      </w:r>
-      <w:r>
-        <w:t xml:space="preserve"> of the product, as from there it connects with the other different services to be able to do what the customer has asked for. When the client asks to make the market forecast, the notification will go from the web server to the node network and from there it will ask the python server for the prediction of the next days. To calculate this prediction</w:t>
+        <w:t>), application users connect to the client and interact with the web page to ask for a forecast or to look at information about different stock market movements. The website connects to the web server where all the controllers are located. This is the centre of the product, as from there it connects with the other different services to be able to do what the customer has asked for. When the client asks to make the market forecast, the notification will go from the web server to the node network and from there it will ask the python server for the prediction of the next days. To calculate this prediction</w:t>
       </w:r>
       <w:r>
         <w:t>,</w:t>
       </w:r>
       <w:r>
-        <w:t xml:space="preserve"> it has to take into account the data stored in the </w:t>
-      </w:r>
-      <w:r>
-        <w:t>InfluxDB</w:t>
-      </w:r>
-      <w:r>
-        <w:t xml:space="preserve"> database, which is updated every day by the method scraping, which will be explained later in the report.</w:t>
+        <w:t xml:space="preserve"> it has to take into account the data stored in the InfluxDB database, which is updated every day by the method scraping, which will be explained later in the report.</w:t>
       </w:r>
     </w:p>
     <w:p>
@@ -5915,7 +6051,7 @@
       <w:r>
         <w:fldChar w:fldCharType="separate"/>
       </w:r>
-      <w:bookmarkStart w:id="13" w:name="_Toc156760795"/>
+      <w:bookmarkStart w:id="13" w:name="_Toc156844211"/>
       <w:r>
         <w:rPr>
           <w:noProof/>
@@ -5955,26 +6091,14 @@
     <w:p>
       <w:r>
         <w:lastRenderedPageBreak/>
-        <w:t xml:space="preserve">In addition to this, the Node-Red is also able to communicate with the user via Gmail. That is done when a new account is created, sending an email verifying the correct creation of the web, as well as when the user forgets its password and wants to change it, conducting him to a page where it can update the password. Finally, there is Jenkins, which makes the execution of the </w:t>
-      </w:r>
-      <w:r>
-        <w:t>SonarQube</w:t>
-      </w:r>
-      <w:r>
-        <w:t xml:space="preserve"> command in an automatic way, in order to ensure that the project code is written in a proper way and that there is </w:t>
-      </w:r>
-      <w:r>
-        <w:t>not</w:t>
-      </w:r>
-      <w:r>
-        <w:t xml:space="preserve"> any error. This is executed every time a push is done to the git repository during the whole development process.</w:t>
+        <w:t>In addition to this, the Node-Red is also able to communicate with the user via Gmail. That is done when a new account is created, sending an email verifying the correct creation of the web, as well as when the user forgets its password and wants to change it, conducting him to a page where it can update the password. Finally, there is Jenkins, which makes the execution of the SonarQube command in an automatic way, in order to ensure that the project code is written in a proper way and that there is not any error. This is executed every time a push is done to the git repository during the whole development process.</w:t>
       </w:r>
     </w:p>
     <w:p>
       <w:pPr>
         <w:pStyle w:val="Ttulo3"/>
       </w:pPr>
-      <w:bookmarkStart w:id="14" w:name="_Toc156760730"/>
+      <w:bookmarkStart w:id="14" w:name="_Toc156844182"/>
       <w:r>
         <w:t>R</w:t>
       </w:r>
@@ -5991,10 +6115,7 @@
         <w:t>Once the system’s whole architecture has been explained, it will be defined the way each part of the application communicates with the rest.</w:t>
       </w:r>
       <w:r>
-        <w:t xml:space="preserve"> </w:t>
-      </w:r>
-      <w:r>
-        <w:t>Regarding the artificial intelligence server, a dataset has been made in InfluxDB with external and internal factors, in addition to the latest stock market movements. This was then used to make the model. First, all the data was pre-processed, which was used to clean unnecessary data that affected other data or did not contribute anything to the model. After that, several models have been applied to see the different results given by each one of them, and, based on the results given, the one that has given the best result was chosen. That means that the one that has been closest to get the prediction right is the one that was chosen. After that, to send the prediction to the web when the user asks for it, it is given by the model in the AI server, which sends the prediction for the two following days to Node-Red to visualise it in the web page.</w:t>
+        <w:t xml:space="preserve"> Regarding the artificial intelligence server, a dataset has been made in InfluxDB with external and internal factors, in addition to the latest stock market movements. This was then used to make the model. First, all the data was pre-processed, which was used to clean unnecessary data that affected other data or did not contribute anything to the model. After that, several models have been applied to see the different results given by each one of them, and, based on the results given, the one that has given the best result was chosen. That means that the one that has been closest to get the prediction right is the one that was chosen. After that, to send the prediction to the web when the user asks for it, it is given by the model in the AI server, which sends the prediction for the two following days to Node-Red to visualise it in the web page.</w:t>
       </w:r>
     </w:p>
     <w:p>
@@ -6009,20 +6130,14 @@
     </w:p>
     <w:p>
       <w:r>
-        <w:t xml:space="preserve">Finally, during the whole development of the product, the team have been testing all the code </w:t>
-      </w:r>
-      <w:r>
-        <w:t>programmed</w:t>
-      </w:r>
-      <w:r>
-        <w:t>, in order to obtain a high percentage of tested coverage, both in the python serve and model part and the web program part. SonarQube has also been used to indicate the mentioned coverage, because the more coverage the code has, the more protected and secure it will be the program. Along with this tool for code’s static analysis, Jenkins tool has been used, the one that automates repetitive and continuous tasks such as building, testing, executing SonarQube and uploading executable files to the Google Cloud server. Jenkins uses the git repository to execute all the automatization every time a push is done to the repository, so that all that commands don’t need to be executed manually.</w:t>
+        <w:t>Finally, during the whole development of the product, the team have been testing all the code programmed, in order to obtain a high percentage of tested coverage, both in the python serve and model part and the web program part. SonarQube has also been used to indicate the mentioned coverage, because the more coverage the code has, the more protected and secure it will be the program. Along with this tool for code’s static analysis, Jenkins tool has been used, the one that automates repetitive and continuous tasks such as building, testing, executing SonarQube and uploading executable files to the Google Cloud server. Jenkins uses the git repository to execute all the automatization every time a push is done to the repository, so that all that commands don’t need to be executed manually.</w:t>
       </w:r>
     </w:p>
     <w:p>
       <w:pPr>
         <w:pStyle w:val="Ttulo2"/>
       </w:pPr>
-      <w:bookmarkStart w:id="15" w:name="_Toc156760731"/>
+      <w:bookmarkStart w:id="15" w:name="_Toc156844183"/>
       <w:r>
         <w:lastRenderedPageBreak/>
         <w:t>Artificial intelligence</w:t>
@@ -6034,14 +6149,22 @@
         <w:ind w:firstLine="709"/>
       </w:pPr>
       <w:r>
-        <w:t>Once that the whole product itself and the relationship between different parts have been explained, it will start the technical explanation of each one of them, starting with the artificial intelligence part. In this section, first of all, the planification of the AI model will de defined, explaining which factors have been considered for it. After that, it will be explained how the model have been developed, explaining all the process to develop it. Finally, the results obtained will be presented, in order to see how all this process contributed to the objective of creating realistic predictions.</w:t>
+        <w:t xml:space="preserve">Once that the whole product itself and the relationship between different parts have been explained, it will start the technical explanation of each one of them, starting with the artificial intelligence part. In this section, first of all, the planification of the AI model will </w:t>
+      </w:r>
+      <w:proofErr w:type="spellStart"/>
+      <w:r>
+        <w:t>de</w:t>
+      </w:r>
+      <w:proofErr w:type="spellEnd"/>
+      <w:r>
+        <w:t xml:space="preserve"> defined, explaining which factors have been considered for it. After that, it will be explained how the model have been developed, explaining all the process to develop it. Finally, the results obtained will be presented, in order to see how all this process contributed to the objective of creating realistic predictions.</w:t>
       </w:r>
     </w:p>
     <w:p>
       <w:pPr>
         <w:pStyle w:val="Ttulo3"/>
       </w:pPr>
-      <w:bookmarkStart w:id="16" w:name="_Toc156760732"/>
+      <w:bookmarkStart w:id="16" w:name="_Toc156844184"/>
       <w:r>
         <w:t>Planification</w:t>
       </w:r>
@@ -6113,7 +6236,7 @@
       <w:pPr>
         <w:pStyle w:val="Ttulo3"/>
       </w:pPr>
-      <w:bookmarkStart w:id="17" w:name="_Toc156760733"/>
+      <w:bookmarkStart w:id="17" w:name="_Toc156844185"/>
       <w:r>
         <w:t>Model’s development</w:t>
       </w:r>
@@ -6150,7 +6273,7 @@
       <w:pPr>
         <w:pStyle w:val="Ttulo3"/>
       </w:pPr>
-      <w:bookmarkStart w:id="18" w:name="_Toc156760734"/>
+      <w:bookmarkStart w:id="18" w:name="_Toc156844186"/>
       <w:r>
         <w:t>Results</w:t>
       </w:r>
@@ -6174,7 +6297,7 @@
       <w:pPr>
         <w:pStyle w:val="Ttulo2"/>
       </w:pPr>
-      <w:bookmarkStart w:id="19" w:name="_Toc156760735"/>
+      <w:bookmarkStart w:id="19" w:name="_Toc156844187"/>
       <w:r>
         <w:t>Web program</w:t>
       </w:r>
@@ -6205,7 +6328,7 @@
       <w:pPr>
         <w:pStyle w:val="Ttulo3"/>
       </w:pPr>
-      <w:bookmarkStart w:id="20" w:name="_Toc156760736"/>
+      <w:bookmarkStart w:id="20" w:name="_Toc156844188"/>
       <w:r>
         <w:t>Server functioning</w:t>
       </w:r>
@@ -6228,7 +6351,7 @@
       <w:pPr>
         <w:pStyle w:val="Ttulo3"/>
       </w:pPr>
-      <w:bookmarkStart w:id="21" w:name="_Toc156760737"/>
+      <w:bookmarkStart w:id="21" w:name="_Toc156844189"/>
       <w:r>
         <w:t>Functionalities</w:t>
       </w:r>
@@ -6284,7 +6407,7 @@
       <w:pPr>
         <w:pStyle w:val="Ttulo3"/>
       </w:pPr>
-      <w:bookmarkStart w:id="22" w:name="_Toc156760738"/>
+      <w:bookmarkStart w:id="22" w:name="_Toc156844190"/>
       <w:r>
         <w:t>Systems’ connection</w:t>
       </w:r>
@@ -6355,7 +6478,7 @@
           <w:bdr w:val="none" w:sz="0" w:space="0" w:color="auto" w:frame="1"/>
         </w:rPr>
         <w:drawing>
-          <wp:inline distT="0" distB="0" distL="0" distR="0" wp14:anchorId="21316F49" wp14:editId="2BB74197">
+          <wp:inline distT="0" distB="0" distL="0" distR="0" wp14:anchorId="21316F49" wp14:editId="7174552A">
             <wp:extent cx="5704417" cy="889000"/>
             <wp:effectExtent l="0" t="0" r="0" b="6350"/>
             <wp:docPr id="342436630" name="Imagen 2" descr="Interfaz de usuario gráfica, Aplicación&#10;&#10;Descripción generada automáticamente"/>
@@ -6422,7 +6545,7 @@
       <w:r>
         <w:fldChar w:fldCharType="separate"/>
       </w:r>
-      <w:bookmarkStart w:id="24" w:name="_Toc156760796"/>
+      <w:bookmarkStart w:id="24" w:name="_Toc156844212"/>
       <w:r>
         <w:rPr>
           <w:noProof/>
@@ -6463,7 +6586,7 @@
       <w:pPr>
         <w:pStyle w:val="Ttulo3"/>
       </w:pPr>
-      <w:bookmarkStart w:id="25" w:name="_Toc156760739"/>
+      <w:bookmarkStart w:id="25" w:name="_Toc156844191"/>
       <w:r>
         <w:t>Structure of the web page</w:t>
       </w:r>
@@ -6625,7 +6748,7 @@
       <w:r>
         <w:fldChar w:fldCharType="separate"/>
       </w:r>
-      <w:bookmarkStart w:id="27" w:name="_Toc156760797"/>
+      <w:bookmarkStart w:id="27" w:name="_Toc156844213"/>
       <w:r>
         <w:rPr>
           <w:noProof/>
@@ -6725,7 +6848,7 @@
           <w:bdr w:val="none" w:sz="0" w:space="0" w:color="auto" w:frame="1"/>
         </w:rPr>
         <w:drawing>
-          <wp:inline distT="0" distB="0" distL="0" distR="0" wp14:anchorId="006574C9" wp14:editId="467D3550">
+          <wp:inline distT="0" distB="0" distL="0" distR="0" wp14:anchorId="006574C9" wp14:editId="5EF82A1C">
             <wp:extent cx="5731510" cy="2859405"/>
             <wp:effectExtent l="0" t="0" r="2540" b="0"/>
             <wp:docPr id="964188130" name="Imagen 8" descr="Gráfico&#10;&#10;Descripción generada automáticamente"/>
@@ -6789,7 +6912,7 @@
       <w:r>
         <w:fldChar w:fldCharType="separate"/>
       </w:r>
-      <w:bookmarkStart w:id="29" w:name="_Toc156760798"/>
+      <w:bookmarkStart w:id="29" w:name="_Toc156844214"/>
       <w:r>
         <w:rPr>
           <w:noProof/>
@@ -6830,7 +6953,7 @@
       <w:pPr>
         <w:pStyle w:val="Ttulo2"/>
       </w:pPr>
-      <w:bookmarkStart w:id="30" w:name="_Toc156760740"/>
+      <w:bookmarkStart w:id="30" w:name="_Toc156844192"/>
       <w:r>
         <w:t>Thread simulation</w:t>
       </w:r>
@@ -6860,7 +6983,7 @@
       <w:pPr>
         <w:pStyle w:val="Ttulo3"/>
       </w:pPr>
-      <w:bookmarkStart w:id="31" w:name="_Toc156760741"/>
+      <w:bookmarkStart w:id="31" w:name="_Toc156844193"/>
       <w:r>
         <w:t>Design</w:t>
       </w:r>
@@ -6939,7 +7062,7 @@
       <w:pPr>
         <w:pStyle w:val="Ttulo3"/>
       </w:pPr>
-      <w:bookmarkStart w:id="32" w:name="_Toc156760742"/>
+      <w:bookmarkStart w:id="32" w:name="_Toc156844194"/>
       <w:r>
         <w:t>Synchroni</w:t>
       </w:r>
@@ -7105,7 +7228,7 @@
       <w:r>
         <w:fldChar w:fldCharType="separate"/>
       </w:r>
-      <w:bookmarkStart w:id="34" w:name="_Toc156760799"/>
+      <w:bookmarkStart w:id="34" w:name="_Toc156844215"/>
       <w:r>
         <w:rPr>
           <w:noProof/>
@@ -7174,13 +7297,7 @@
         <w:t xml:space="preserve"> </w:t>
       </w:r>
       <w:r>
-        <w:t>In the image below the functioning of th</w:t>
-      </w:r>
-      <w:r>
-        <w:t>e</w:t>
-      </w:r>
-      <w:r>
-        <w:t xml:space="preserve"> barrier can be seen (</w:t>
+        <w:t>In the image below the functioning of the barrier can be seen (</w:t>
       </w:r>
       <w:r>
         <w:fldChar w:fldCharType="begin"/>
@@ -7296,7 +7413,7 @@
       <w:r>
         <w:fldChar w:fldCharType="separate"/>
       </w:r>
-      <w:bookmarkStart w:id="36" w:name="_Toc156760800"/>
+      <w:bookmarkStart w:id="36" w:name="_Toc156844216"/>
       <w:r>
         <w:rPr>
           <w:noProof/>
@@ -7337,7 +7454,7 @@
       <w:pPr>
         <w:pStyle w:val="Ttulo3"/>
       </w:pPr>
-      <w:bookmarkStart w:id="37" w:name="_Toc156760743"/>
+      <w:bookmarkStart w:id="37" w:name="_Toc156844195"/>
       <w:r>
         <w:t>Synchroni</w:t>
       </w:r>
@@ -7447,7 +7564,7 @@
       <w:pPr>
         <w:pStyle w:val="Ttulo2"/>
       </w:pPr>
-      <w:bookmarkStart w:id="38" w:name="_Toc156760744"/>
+      <w:bookmarkStart w:id="38" w:name="_Toc156844196"/>
       <w:r>
         <w:t>Program’s validation and automation</w:t>
       </w:r>
@@ -7465,7 +7582,7 @@
       <w:pPr>
         <w:pStyle w:val="Ttulo3"/>
       </w:pPr>
-      <w:bookmarkStart w:id="39" w:name="_Toc156760745"/>
+      <w:bookmarkStart w:id="39" w:name="_Toc156844197"/>
       <w:r>
         <w:t>T</w:t>
       </w:r>
@@ -7496,7 +7613,7 @@
       <w:pPr>
         <w:pStyle w:val="Ttulo3"/>
       </w:pPr>
-      <w:bookmarkStart w:id="40" w:name="_Toc156760746"/>
+      <w:bookmarkStart w:id="40" w:name="_Toc156844198"/>
       <w:r>
         <w:t>S</w:t>
       </w:r>
@@ -7528,7 +7645,7 @@
       <w:pPr>
         <w:pStyle w:val="Ttulo3"/>
       </w:pPr>
-      <w:bookmarkStart w:id="41" w:name="_Toc156760747"/>
+      <w:bookmarkStart w:id="41" w:name="_Toc156844199"/>
       <w:r>
         <w:t>A</w:t>
       </w:r>
@@ -7659,7 +7776,7 @@
       <w:r>
         <w:fldChar w:fldCharType="separate"/>
       </w:r>
-      <w:bookmarkStart w:id="43" w:name="_Toc156760801"/>
+      <w:bookmarkStart w:id="43" w:name="_Toc156844217"/>
       <w:r>
         <w:rPr>
           <w:noProof/>
@@ -7758,7 +7875,7 @@
           <w:bdr w:val="none" w:sz="0" w:space="0" w:color="auto" w:frame="1"/>
         </w:rPr>
         <w:drawing>
-          <wp:inline distT="0" distB="0" distL="0" distR="0" wp14:anchorId="56C762D8" wp14:editId="04FFA55B">
+          <wp:inline distT="0" distB="0" distL="0" distR="0" wp14:anchorId="56C762D8" wp14:editId="117F62A6">
             <wp:extent cx="5706743" cy="2425700"/>
             <wp:effectExtent l="0" t="0" r="8890" b="0"/>
             <wp:docPr id="2006212033" name="Imagen 1" descr="Gráfico, Gráfico de líneas&#10;&#10;Descripción generada automáticamente"/>
@@ -7825,7 +7942,7 @@
       <w:r>
         <w:fldChar w:fldCharType="separate"/>
       </w:r>
-      <w:bookmarkStart w:id="45" w:name="_Toc156760802"/>
+      <w:bookmarkStart w:id="45" w:name="_Toc156844218"/>
       <w:r>
         <w:rPr>
           <w:noProof/>
@@ -7884,7 +8001,7 @@
       <w:pPr>
         <w:pStyle w:val="Ttulo1"/>
       </w:pPr>
-      <w:bookmarkStart w:id="46" w:name="_Toc156760748"/>
+      <w:bookmarkStart w:id="46" w:name="_Toc156844200"/>
       <w:r>
         <w:lastRenderedPageBreak/>
         <w:t>Conclusions</w:t>
@@ -7930,7 +8047,7 @@
       <w:pPr>
         <w:pStyle w:val="Ttulo2"/>
       </w:pPr>
-      <w:bookmarkStart w:id="47" w:name="_Toc156760749"/>
+      <w:bookmarkStart w:id="47" w:name="_Toc156844201"/>
       <w:r>
         <w:t>Planification’s conclusions</w:t>
       </w:r>
@@ -7983,85 +8100,231 @@
     </w:p>
     <w:p>
       <w:r>
-        <w:t>In the planning that was done at the beginning, the works that lay the foundations of the project, it was agreed to be done at the beginning of the project in order to have a clear basis for the rest of the projects. Comparing it with the current Gantt, that fact has been fully respected, and those activities have been done to the letter as it can be seen in the current Gantt. However, from then on, as the project progressed, several activities had to be postponed and extended due to problems or unforeseen events during the duration of the project, but in the end most of the activities planned at the beginning of the project were successfully done. The only activity that has not even been started, due to lack of time, is the forum recommendation system that was planned in the initial Gantt for the last days of the project. The rest of the activities planned have been carried out, even if some of them have been out of date.</w:t>
-      </w:r>
-    </w:p>
-    <w:p>
-      <w:pPr>
+        <w:t>In the planning that was done at the beginning, the works that lay the foundations of the project, it was agreed to be done at the beginning of the project in order to have a clear basis for the rest of the projects. Comparing it with the current Gantt</w:t>
+      </w:r>
+      <w:r>
+        <w:t>, which can be seen in the image below (</w:t>
+      </w:r>
+      <w:r>
+        <w:fldChar w:fldCharType="begin"/>
+      </w:r>
+      <w:r>
+        <w:instrText xml:space="preserve"> REF _Ref156843462 \h </w:instrText>
+      </w:r>
+      <w:r>
+        <w:fldChar w:fldCharType="separate"/>
+      </w:r>
+      <w:r>
+        <w:rPr>
+          <w:noProof/>
+        </w:rPr>
+        <w:t>4</w:t>
+      </w:r>
+      <w:r>
+        <w:noBreakHyphen/>
+      </w:r>
+      <w:r>
+        <w:rPr>
+          <w:noProof/>
+        </w:rPr>
+        <w:t>1</w:t>
+      </w:r>
+      <w:r>
+        <w:t>. Figure: Project's final Gantt chart</w:t>
+      </w:r>
+      <w:r>
+        <w:fldChar w:fldCharType="end"/>
+      </w:r>
+      <w:r>
+        <w:t>)</w:t>
+      </w:r>
+      <w:r>
+        <w:t>, that fact has been fully respected, and those activities have been done to the letter as it can be seen in the current Gantt. However, from then on, as the project progressed, several activities had to be postponed and extended due to problems or unforeseen events during the duration of the project, but in the end most of the activities planned at the beginning of the project were successfully done. The only activity that has not even been started, due to lack of time, is the forum recommendation system that was planned in the initial Gantt for the last days of the project. The rest of the activities planned have been carried out, even if some of them have been out of date.</w:t>
+      </w:r>
+    </w:p>
+    <w:p>
+      <w:pPr>
+        <w:keepNext/>
         <w:jc w:val="center"/>
       </w:pPr>
+      <w:r>
+        <w:rPr>
+          <w:rFonts w:cs="Arial"/>
+          <w:noProof/>
+          <w:color w:val="000000"/>
+          <w:bdr w:val="none" w:sz="0" w:space="0" w:color="auto" w:frame="1"/>
+        </w:rPr>
+        <w:lastRenderedPageBreak/>
+        <w:drawing>
+          <wp:inline distT="0" distB="0" distL="0" distR="0" wp14:anchorId="02EB0A68" wp14:editId="088368A4">
+            <wp:extent cx="5731510" cy="2697480"/>
+            <wp:effectExtent l="0" t="0" r="2540" b="7620"/>
+            <wp:docPr id="1260576549" name="Imagen 1" descr="Escala de tiempo&#10;&#10;Descripción generada automáticamente"/>
+            <wp:cNvGraphicFramePr>
+              <a:graphicFrameLocks xmlns:a="http://schemas.openxmlformats.org/drawingml/2006/main" noChangeAspect="1"/>
+            </wp:cNvGraphicFramePr>
+            <a:graphic xmlns:a="http://schemas.openxmlformats.org/drawingml/2006/main">
+              <a:graphicData uri="http://schemas.openxmlformats.org/drawingml/2006/picture">
+                <pic:pic xmlns:pic="http://schemas.openxmlformats.org/drawingml/2006/picture">
+                  <pic:nvPicPr>
+                    <pic:cNvPr id="1260576549" name="Imagen 1" descr="Escala de tiempo&#10;&#10;Descripción generada automáticamente"/>
+                    <pic:cNvPicPr>
+                      <a:picLocks noChangeAspect="1" noChangeArrowheads="1"/>
+                    </pic:cNvPicPr>
+                  </pic:nvPicPr>
+                  <pic:blipFill>
+                    <a:blip r:embed="rId48" cstate="print">
+                      <a:extLst>
+                        <a:ext uri="{28A0092B-C50C-407E-A947-70E740481C1C}">
+                          <a14:useLocalDpi xmlns:a14="http://schemas.microsoft.com/office/drawing/2010/main" val="0"/>
+                        </a:ext>
+                      </a:extLst>
+                    </a:blip>
+                    <a:srcRect/>
+                    <a:stretch>
+                      <a:fillRect/>
+                    </a:stretch>
+                  </pic:blipFill>
+                  <pic:spPr bwMode="auto">
+                    <a:xfrm>
+                      <a:off x="0" y="0"/>
+                      <a:ext cx="5731510" cy="2697480"/>
+                    </a:xfrm>
+                    <a:prstGeom prst="rect">
+                      <a:avLst/>
+                    </a:prstGeom>
+                    <a:noFill/>
+                    <a:ln>
+                      <a:noFill/>
+                    </a:ln>
+                  </pic:spPr>
+                </pic:pic>
+              </a:graphicData>
+            </a:graphic>
+          </wp:inline>
+        </w:drawing>
+      </w:r>
+    </w:p>
+    <w:bookmarkStart w:id="48" w:name="_Ref156843462"/>
+    <w:p>
+      <w:pPr>
+        <w:pStyle w:val="Descripcin"/>
+        <w:jc w:val="center"/>
+      </w:pPr>
+      <w:r>
+        <w:fldChar w:fldCharType="begin"/>
+      </w:r>
+      <w:r>
+        <w:instrText xml:space="preserve"> STYLEREF 1 \s </w:instrText>
+      </w:r>
+      <w:r>
+        <w:fldChar w:fldCharType="separate"/>
+      </w:r>
+      <w:bookmarkStart w:id="49" w:name="_Toc156844219"/>
+      <w:r>
+        <w:rPr>
+          <w:noProof/>
+        </w:rPr>
+        <w:t>4</w:t>
+      </w:r>
+      <w:r>
+        <w:fldChar w:fldCharType="end"/>
+      </w:r>
+      <w:r>
+        <w:noBreakHyphen/>
+      </w:r>
+      <w:r>
+        <w:fldChar w:fldCharType="begin"/>
+      </w:r>
+      <w:r>
+        <w:instrText xml:space="preserve"> SEQ Figure \* ARABIC \s 1 </w:instrText>
+      </w:r>
+      <w:r>
+        <w:fldChar w:fldCharType="separate"/>
+      </w:r>
+      <w:r>
+        <w:rPr>
+          <w:noProof/>
+        </w:rPr>
+        <w:t>1</w:t>
+      </w:r>
+      <w:r>
+        <w:fldChar w:fldCharType="end"/>
+      </w:r>
+      <w:r>
+        <w:t>. Figure: Project's final Gantt chart</w:t>
+      </w:r>
+      <w:bookmarkEnd w:id="48"/>
+      <w:bookmarkEnd w:id="49"/>
     </w:p>
     <w:p>
       <w:pPr>
         <w:pStyle w:val="Ttulo2"/>
       </w:pPr>
-      <w:bookmarkStart w:id="48" w:name="_Toc156760750"/>
+      <w:bookmarkStart w:id="50" w:name="_Toc156844202"/>
       <w:r>
         <w:t>Problem’s solving</w:t>
       </w:r>
-      <w:bookmarkEnd w:id="48"/>
+      <w:bookmarkEnd w:id="50"/>
     </w:p>
     <w:p>
       <w:pPr>
         <w:ind w:firstLine="709"/>
       </w:pPr>
       <w:r>
-        <w:t xml:space="preserve">Once the project’s planification conclusions have been taken, it will be explained whether the problem that was raised at the beginning of this report has been solved or not. At </w:t>
-      </w:r>
+        <w:t>Once the project’s planification conclusions have been taken, it will be explained whether the problem that was raised at the beginning of this report has been solved or not. At the beginning of this report, it was stated that 98% of people who invest in the stock market lose money and that, in general, a big amount of the public has little knowledge about the stock market. In addition, it was stated that the main problem with the stock market is that there are too many external factors that affect the stock market and that the human being, being a rational being and not a machine, is not able to analyse them all in real time, as by the time they have been analysed the</w:t>
+      </w:r>
+      <w:r>
+        <w:t>y</w:t>
+      </w:r>
+      <w:r>
+        <w:t xml:space="preserve"> have been changed again.</w:t>
+      </w:r>
+    </w:p>
+    <w:p>
+      <w:r>
+        <w:t>After the completion of the project, it is believed that the first problem has been partially solved, because even if it is impossible that nobody loses money on the stock market, mainly because it is not possible, it has contributed the users to make better investments. Regarding the second problem, it has been concluded that it has been solved. By using the product that has been created, people have the possibility to learn how the stock market works and how external factors that may often seem insignificant can change the course of the stock market’s value. Finally, a satisfactory solution has been found to the problem of humans and their inability to analyse thousands of pieces of data, as a machine learning model has been created that is capable of analysing and responding to tens of thousands of pieces of data. In addition, by using the previously explained scraping method, the database is updated every day, so that the new predictions have the updated data.</w:t>
+      </w:r>
+    </w:p>
+    <w:p>
+      <w:pPr>
+        <w:pStyle w:val="Ttulo2"/>
+      </w:pPr>
+      <w:bookmarkStart w:id="51" w:name="_Toc156844203"/>
+      <w:r>
+        <w:t>Objectives achievements</w:t>
+      </w:r>
+      <w:bookmarkEnd w:id="51"/>
+    </w:p>
+    <w:p>
+      <w:pPr>
+        <w:ind w:firstLine="709"/>
+      </w:pPr>
+      <w:r>
+        <w:t>Once the main objective has been justified, an assessment of the achievement of the various objectives contained in the project will be carried out. Although many of the objectives initially defined in the project have been achieved, there are others that have not been achieved in the prototype and have remained in the form of future lines.</w:t>
+      </w:r>
+      <w:r>
+        <w:t xml:space="preserve"> Those objectives were the i</w:t>
+      </w:r>
+      <w:r>
+        <w:t>ndicator of the project's success or failure</w:t>
+      </w:r>
+      <w:r>
+        <w:t>. T</w:t>
+      </w:r>
+      <w:r>
+        <w:t>h</w:t>
+      </w:r>
+      <w:r>
+        <w:t>o</w:t>
+      </w:r>
+      <w:r>
+        <w:t>se objectives were as follows: to develop a robust AI model to make stock market predictions, to minimise investment risks through a comprehensive risk assessment, to help users understand the stock market, to create a forum for users, and to develop a user recommendation system.</w:t>
+      </w:r>
+    </w:p>
+    <w:p>
       <w:r>
         <w:lastRenderedPageBreak/>
-        <w:t>the beginning of this report, it was stated that 98% of people who invest in the stock market lose money and that, in general, a big amount of the public has little knowledge about the stock market. In addition, it was stated that the main problem with the stock market is that there are too many external factors that affect the stock market and that the human being, being a rational being and not a machine, is not able to analyse them all in real time, as by the time they have been analysed the</w:t>
-      </w:r>
-      <w:r>
-        <w:t>y</w:t>
-      </w:r>
-      <w:r>
-        <w:t xml:space="preserve"> have been changed again.</w:t>
-      </w:r>
-    </w:p>
-    <w:p>
-      <w:r>
-        <w:t>After the completion of the project, it is believed that the first problem has been partially solved, because even if it is impossible that nobody loses money on the stock market, mainly because it is not possible, it has contributed the users to make better investments. Regarding the second problem, it has been concluded that it has been solved. By using the product that has been created, people have the possibility to learn how the stock market works and how external factors that may often seem insignificant can change the course of the stock market’s value. Finally, a satisfactory solution has been found to the problem of humans and their inability to analyse thousands of pieces of data, as a machine learning model has been created that is capable of analysing and responding to tens of thousands of pieces of data. In addition, by using the previously explained scraping method, the database is updated every day, so that the new predictions have the updated data.</w:t>
-      </w:r>
-    </w:p>
-    <w:p>
-      <w:pPr>
-        <w:pStyle w:val="Ttulo2"/>
-      </w:pPr>
-      <w:bookmarkStart w:id="49" w:name="_Toc156760751"/>
-      <w:r>
-        <w:t>Objectives achievements</w:t>
-      </w:r>
-      <w:bookmarkEnd w:id="49"/>
-    </w:p>
-    <w:p>
-      <w:pPr>
-        <w:ind w:firstLine="709"/>
-      </w:pPr>
-      <w:r>
-        <w:t>Once the main objective has been justified, an assessment of the achievement of the various objectives contained in the project will be carried out. Although many of the objectives initially defined in the project have been achieved, there are others that have not been achieved in the prototype and have remained in the form of future lines.</w:t>
-      </w:r>
-      <w:r>
-        <w:t xml:space="preserve"> Those objectives were the i</w:t>
-      </w:r>
-      <w:r>
-        <w:t>ndicator of the project's success or failure</w:t>
-      </w:r>
-      <w:r>
-        <w:t>. T</w:t>
-      </w:r>
-      <w:r>
-        <w:t>h</w:t>
-      </w:r>
-      <w:r>
-        <w:t>o</w:t>
-      </w:r>
-      <w:r>
-        <w:t>se objectives were as follows: to develop a robust AI model to make stock market predictions, to minimise investment risks through a comprehensive risk assessment, to help users understand the stock market, to create a forum for users, and to develop a user recommendation system.</w:t>
-      </w:r>
-    </w:p>
-    <w:p>
-      <w:r>
         <w:t>Among the objectives that have been achieved are to help users understand the stock market, as a search section has been created where the user can see the chronology of the different external factors and the changes</w:t>
       </w:r>
       <w:r>
@@ -8112,7 +8375,7 @@
         <w:t>).</w:t>
       </w:r>
     </w:p>
-    <w:bookmarkStart w:id="50" w:name="_Ref156753432"/>
+    <w:bookmarkStart w:id="52" w:name="_Ref156753432"/>
     <w:p>
       <w:pPr>
         <w:pStyle w:val="Descripcin"/>
@@ -8128,7 +8391,7 @@
       <w:r>
         <w:fldChar w:fldCharType="separate"/>
       </w:r>
-      <w:bookmarkStart w:id="51" w:name="_Toc156760803"/>
+      <w:bookmarkStart w:id="53" w:name="_Toc156844221"/>
       <w:r>
         <w:rPr>
           <w:noProof/>
@@ -8162,8 +8425,8 @@
       <w:r>
         <w:t>. Table: Objectives achieved and in process of achieving</w:t>
       </w:r>
-      <w:bookmarkEnd w:id="50"/>
-      <w:bookmarkEnd w:id="51"/>
+      <w:bookmarkEnd w:id="52"/>
+      <w:bookmarkEnd w:id="53"/>
     </w:p>
     <w:tbl>
       <w:tblPr>
@@ -8272,7 +8535,6 @@
                 <w:rFonts w:cs="Arial"/>
                 <w:color w:val="000000"/>
               </w:rPr>
-              <w:lastRenderedPageBreak/>
               <w:t>Develop a robust AI model for stock market predictions</w:t>
             </w:r>
           </w:p>
@@ -8490,33 +8752,178 @@
       <w:pPr>
         <w:pStyle w:val="Ttulo2"/>
       </w:pPr>
-      <w:bookmarkStart w:id="52" w:name="_Toc156760752"/>
+      <w:bookmarkStart w:id="54" w:name="_Toc156844204"/>
       <w:r>
         <w:t>SDG</w:t>
       </w:r>
       <w:r>
         <w:t xml:space="preserve"> impact evaluation</w:t>
       </w:r>
-      <w:bookmarkEnd w:id="52"/>
+      <w:bookmarkEnd w:id="54"/>
     </w:p>
     <w:p>
       <w:pPr>
         <w:ind w:firstLine="709"/>
       </w:pPr>
       <w:r>
-        <w:t>On September 25, 2015, world leaders set themselves 17 global goals to eradicate poverty, protect the planet, and ensure prosperity within a new 2030 agenda for sustainable development. Each objective has specific objectives to be achieved over the next 15 years. Therefore, in order to achieve these objectives, this project aims to achieve a number of these objectives in order to promote many of the achievements that are intended to be eradicated or promoted and to contribute to the overall objective set for 2030. This project has therefore sought to influence as many of these objectives as possible ().</w:t>
+        <w:t>On September 25, 2015, world leaders set themselves 17 global goals to eradicate poverty, protect the planet, and ensure prosperity within a new 2030 agenda for sustainable development. Each objective has specific objectives to be achieved over the next 15 years. Therefore, in order to achieve these objectives, this project aims to achieve a number of these objectives in order to promote many of the achievements that are intended to be eradicated or promoted and to contribute to the overall objective set for 2030. This project has therefore sought to influence as many of these objectives as possible.</w:t>
       </w:r>
     </w:p>
     <w:p>
       <w:r>
         <w:t>To end the section on conclusions, a reminder will be made of the Sustainable Development Goals that were said to be met at the beginning of the project and it will be seen whether they were met or not. At the beginning of the project development, it was said that the finished project could meet the following goals: Quality Education, Decent Work and Economic Growth and Industry, Innovation, and Infrastructure. At the conclusion of the project, it is believed that the 3 sustainable development objectives that were proposed have been met.</w:t>
       </w:r>
+      <w:r>
+        <w:t xml:space="preserve"> In the image below it can be seen those goals in which the project has been directly positive, as well as the ones in which it has been indirectly positive (</w:t>
+      </w:r>
+      <w:r>
+        <w:fldChar w:fldCharType="begin"/>
+      </w:r>
+      <w:r>
+        <w:instrText xml:space="preserve"> REF _Ref156843940 \h </w:instrText>
+      </w:r>
+      <w:r>
+        <w:fldChar w:fldCharType="separate"/>
+      </w:r>
+      <w:r>
+        <w:rPr>
+          <w:noProof/>
+        </w:rPr>
+        <w:t>4</w:t>
+      </w:r>
+      <w:r>
+        <w:noBreakHyphen/>
+      </w:r>
+      <w:r>
+        <w:rPr>
+          <w:noProof/>
+        </w:rPr>
+        <w:t>2</w:t>
+      </w:r>
+      <w:r>
+        <w:t xml:space="preserve">. Figure: </w:t>
+      </w:r>
+      <w:r>
+        <w:t>SDG alignment evaluation summary</w:t>
+      </w:r>
+      <w:r>
+        <w:fldChar w:fldCharType="end"/>
+      </w:r>
+      <w:r>
+        <w:t>).</w:t>
+      </w:r>
+    </w:p>
+    <w:p>
+      <w:pPr>
+        <w:keepNext/>
+        <w:jc w:val="center"/>
+      </w:pPr>
+      <w:r>
+        <w:lastRenderedPageBreak/>
+        <w:drawing>
+          <wp:inline distT="0" distB="0" distL="0" distR="0" wp14:anchorId="049A8659" wp14:editId="084B193F">
+            <wp:extent cx="5731510" cy="1981200"/>
+            <wp:effectExtent l="0" t="0" r="2540" b="0"/>
+            <wp:docPr id="621605160" name="Imagen 1" descr="Tabla&#10;&#10;Descripción generada automáticamente"/>
+            <wp:cNvGraphicFramePr>
+              <a:graphicFrameLocks xmlns:a="http://schemas.openxmlformats.org/drawingml/2006/main" noChangeAspect="1"/>
+            </wp:cNvGraphicFramePr>
+            <a:graphic xmlns:a="http://schemas.openxmlformats.org/drawingml/2006/main">
+              <a:graphicData uri="http://schemas.openxmlformats.org/drawingml/2006/picture">
+                <pic:pic xmlns:pic="http://schemas.openxmlformats.org/drawingml/2006/picture">
+                  <pic:nvPicPr>
+                    <pic:cNvPr id="621605160" name="Imagen 1" descr="Tabla&#10;&#10;Descripción generada automáticamente"/>
+                    <pic:cNvPicPr/>
+                  </pic:nvPicPr>
+                  <pic:blipFill rotWithShape="1">
+                    <a:blip r:embed="rId49"/>
+                    <a:srcRect t="8619" b="7352"/>
+                    <a:stretch/>
+                  </pic:blipFill>
+                  <pic:spPr bwMode="auto">
+                    <a:xfrm>
+                      <a:off x="0" y="0"/>
+                      <a:ext cx="5731510" cy="1981200"/>
+                    </a:xfrm>
+                    <a:prstGeom prst="rect">
+                      <a:avLst/>
+                    </a:prstGeom>
+                    <a:ln>
+                      <a:noFill/>
+                    </a:ln>
+                    <a:extLst>
+                      <a:ext uri="{53640926-AAD7-44D8-BBD7-CCE9431645EC}">
+                        <a14:shadowObscured xmlns:a14="http://schemas.microsoft.com/office/drawing/2010/main"/>
+                      </a:ext>
+                    </a:extLst>
+                  </pic:spPr>
+                </pic:pic>
+              </a:graphicData>
+            </a:graphic>
+          </wp:inline>
+        </w:drawing>
+      </w:r>
+    </w:p>
+    <w:bookmarkStart w:id="55" w:name="_Ref156843940"/>
+    <w:p>
+      <w:pPr>
+        <w:pStyle w:val="Descripcin"/>
+        <w:jc w:val="center"/>
+      </w:pPr>
+      <w:r>
+        <w:fldChar w:fldCharType="begin"/>
+      </w:r>
+      <w:r>
+        <w:instrText xml:space="preserve"> STYLEREF 1 \s </w:instrText>
+      </w:r>
+      <w:r>
+        <w:fldChar w:fldCharType="separate"/>
+      </w:r>
+      <w:bookmarkStart w:id="56" w:name="_Toc156844220"/>
+      <w:r>
+        <w:rPr>
+          <w:noProof/>
+        </w:rPr>
+        <w:t>4</w:t>
+      </w:r>
+      <w:r>
+        <w:fldChar w:fldCharType="end"/>
+      </w:r>
+      <w:r>
+        <w:noBreakHyphen/>
+      </w:r>
+      <w:r>
+        <w:fldChar w:fldCharType="begin"/>
+      </w:r>
+      <w:r>
+        <w:instrText xml:space="preserve"> SEQ Figure \* ARABIC \s 1 </w:instrText>
+      </w:r>
+      <w:r>
+        <w:fldChar w:fldCharType="separate"/>
+      </w:r>
+      <w:r>
+        <w:rPr>
+          <w:noProof/>
+        </w:rPr>
+        <w:t>2</w:t>
+      </w:r>
+      <w:r>
+        <w:fldChar w:fldCharType="end"/>
+      </w:r>
+      <w:r>
+        <w:t xml:space="preserve">. Figure: </w:t>
+      </w:r>
+      <w:r>
+        <w:t>SDG alignment evaluation summary</w:t>
+      </w:r>
+      <w:bookmarkEnd w:id="55"/>
+      <w:bookmarkEnd w:id="56"/>
     </w:p>
     <w:p>
       <w:pPr>
         <w:sectPr>
-          <w:headerReference w:type="first" r:id="rId48"/>
-          <w:footerReference w:type="first" r:id="rId49"/>
+          <w:headerReference w:type="first" r:id="rId50"/>
+          <w:footerReference w:type="first" r:id="rId51"/>
           <w:pgSz w:w="11906" w:h="16838"/>
           <w:pgMar w:top="1440" w:right="1440" w:bottom="1440" w:left="1440" w:header="720" w:footer="720" w:gutter="0"/>
           <w:cols w:space="720"/>
@@ -8527,17 +8934,44 @@
       <w:r>
         <w:t>In the Quality Education objective, it is believed that it has been fulfilled because on the web page that has been created there is a whole section that simply serves to explain how external factors influence the stock market and how each of them influences it. In the same way, a financially well-educated society is always positive for the state and the economy of a country, as more entrepreneurs and companies can emerge, which is why the objective of Decent Work and Economic Growth is fulfilled. Finally, the objective of Industry, Innovation and Infrastructure is fulfilled because different cutting-edge technologies have been used to make this project, such as the use of machine learning or web technology, which is why it has contributed to innovation and technological development.</w:t>
       </w:r>
+      <w:r>
+        <w:t xml:space="preserve"> The more detailed alignment with these objectives can be found in </w:t>
+      </w:r>
+      <w:r>
+        <w:fldChar w:fldCharType="begin"/>
+      </w:r>
+      <w:r>
+        <w:instrText xml:space="preserve"> REF _Ref156843762 \h </w:instrText>
+      </w:r>
+      <w:r>
+        <w:fldChar w:fldCharType="separate"/>
+      </w:r>
+      <w:r>
+        <w:rPr>
+          <w:noProof/>
+        </w:rPr>
+        <w:t>3</w:t>
+      </w:r>
+      <w:r>
+        <w:t>. Annex: SDG alignment evaluation</w:t>
+      </w:r>
+      <w:r>
+        <w:fldChar w:fldCharType="end"/>
+      </w:r>
+      <w:r>
+        <w:t>.</w:t>
+      </w:r>
     </w:p>
     <w:p>
       <w:pPr>
         <w:pStyle w:val="Ttulo1"/>
       </w:pPr>
-      <w:bookmarkStart w:id="53" w:name="_Toc156760753"/>
+      <w:bookmarkStart w:id="57" w:name="_Toc156844205"/>
       <w:r>
         <w:lastRenderedPageBreak/>
         <w:t>Future lines</w:t>
       </w:r>
-      <w:bookmarkEnd w:id="53"/>
+      <w:bookmarkEnd w:id="57"/>
     </w:p>
     <w:p>
       <w:pPr>
@@ -8569,11 +9003,11 @@
       <w:pPr>
         <w:pStyle w:val="Ttulo2"/>
       </w:pPr>
-      <w:bookmarkStart w:id="54" w:name="_Toc156760754"/>
+      <w:bookmarkStart w:id="58" w:name="_Toc156844206"/>
       <w:r>
         <w:t>Improvements</w:t>
       </w:r>
-      <w:bookmarkEnd w:id="54"/>
+      <w:bookmarkEnd w:id="58"/>
     </w:p>
     <w:p>
       <w:pPr>
@@ -8587,17 +9021,17 @@
       <w:pPr>
         <w:pStyle w:val="Ttulo2"/>
       </w:pPr>
-      <w:bookmarkStart w:id="55" w:name="_Toc156760755"/>
+      <w:bookmarkStart w:id="59" w:name="_Toc156844207"/>
       <w:r>
         <w:t>Supplements</w:t>
       </w:r>
-      <w:bookmarkEnd w:id="55"/>
+      <w:bookmarkEnd w:id="59"/>
     </w:p>
     <w:p>
       <w:pPr>
         <w:ind w:firstLine="709"/>
         <w:sectPr>
-          <w:footerReference w:type="first" r:id="rId50"/>
+          <w:footerReference w:type="first" r:id="rId52"/>
           <w:pgSz w:w="11906" w:h="16838"/>
           <w:pgMar w:top="1440" w:right="1440" w:bottom="1440" w:left="1440" w:header="720" w:footer="720" w:gutter="0"/>
           <w:cols w:space="720"/>
@@ -8618,7 +9052,7 @@
         <w:t>.</w:t>
       </w:r>
     </w:p>
-    <w:bookmarkStart w:id="56" w:name="_Toc156760756" w:displacedByCustomXml="next"/>
+    <w:bookmarkStart w:id="60" w:name="_Toc156844208" w:displacedByCustomXml="next"/>
     <w:sdt>
       <w:sdtPr>
         <w:rPr>
@@ -8650,7 +9084,7 @@
           <w:r>
             <w:t>phy</w:t>
           </w:r>
-          <w:bookmarkEnd w:id="56"/>
+          <w:bookmarkEnd w:id="60"/>
         </w:p>
         <w:sdt>
           <w:sdtPr>
@@ -9069,7 +9503,7 @@
           <w:tab w:val="left" w:pos="5920"/>
         </w:tabs>
         <w:sectPr>
-          <w:footerReference w:type="first" r:id="rId51"/>
+          <w:footerReference w:type="first" r:id="rId53"/>
           <w:pgSz w:w="11906" w:h="16838"/>
           <w:pgMar w:top="1440" w:right="1440" w:bottom="1440" w:left="1440" w:header="720" w:footer="720" w:gutter="0"/>
           <w:cols w:space="720"/>
@@ -9085,16 +9519,16 @@
       <w:pPr>
         <w:pStyle w:val="Ttulo1"/>
       </w:pPr>
-      <w:bookmarkStart w:id="57" w:name="_Hlk137405933"/>
-      <w:bookmarkStart w:id="58" w:name="_Toc156760757"/>
+      <w:bookmarkStart w:id="61" w:name="_Hlk137405933"/>
+      <w:bookmarkStart w:id="62" w:name="_Toc156844209"/>
       <w:r>
         <w:lastRenderedPageBreak/>
         <w:t>Annexes</w:t>
       </w:r>
-      <w:bookmarkEnd w:id="58"/>
-    </w:p>
-    <w:bookmarkStart w:id="59" w:name="_Ref156758215"/>
-    <w:bookmarkEnd w:id="57"/>
+      <w:bookmarkEnd w:id="62"/>
+    </w:p>
+    <w:bookmarkStart w:id="63" w:name="_Ref156758215"/>
+    <w:bookmarkEnd w:id="61"/>
     <w:p>
       <w:pPr>
         <w:pStyle w:val="Descripcin"/>
@@ -9121,7 +9555,7 @@
       <w:r>
         <w:t>. Annex: Project's initial planning</w:t>
       </w:r>
-      <w:bookmarkEnd w:id="59"/>
+      <w:bookmarkEnd w:id="63"/>
     </w:p>
     <w:p>
       <w:pPr>
@@ -9148,10 +9582,10 @@
             <v:path o:extrusionok="f" gradientshapeok="t" o:connecttype="rect"/>
             <o:lock v:ext="edit" aspectratio="t"/>
           </v:shapetype>
-          <v:shape id="_x0000_i1049" type="#_x0000_t75" style="width:453pt;height:453pt" o:ole="">
-            <v:imagedata r:id="rId52" o:title=""/>
+          <v:shape id="_x0000_i1028" type="#_x0000_t75" style="width:453pt;height:453pt" o:ole="">
+            <v:imagedata r:id="rId54" o:title=""/>
           </v:shape>
-          <o:OLEObject Type="Link" ProgID="Word.Document.12" ShapeID="_x0000_i1049" DrawAspect="Content" r:id="rId53" UpdateMode="Always">
+          <o:OLEObject Type="Link" ProgID="Word.Document.12" ShapeID="_x0000_i1028" DrawAspect="Content" r:id="rId55" UpdateMode="Always">
             <o:LinkType>EnhancedMetaFile</o:LinkType>
             <o:LockedField>false</o:LockedField>
             <o:FieldCodes>\f 0</o:FieldCodes>
@@ -9164,7 +9598,7 @@
         <w:pStyle w:val="Descripcin"/>
         <w:keepNext/>
         <w:sectPr>
-          <w:footerReference w:type="default" r:id="rId54"/>
+          <w:footerReference w:type="default" r:id="rId56"/>
           <w:pgSz w:w="11906" w:h="16838"/>
           <w:pgMar w:top="1440" w:right="1440" w:bottom="1440" w:left="1440" w:header="720" w:footer="720" w:gutter="0"/>
           <w:cols w:space="720"/>
@@ -9173,7 +9607,7 @@
         </w:sectPr>
       </w:pPr>
     </w:p>
-    <w:bookmarkStart w:id="60" w:name="_Ref156759144"/>
+    <w:bookmarkStart w:id="64" w:name="_Ref156759144"/>
     <w:p>
       <w:pPr>
         <w:pStyle w:val="Descripcin"/>
@@ -9201,7 +9635,7 @@
       <w:r>
         <w:t>. Annex: Meetings' minutes</w:t>
       </w:r>
-      <w:bookmarkEnd w:id="60"/>
+      <w:bookmarkEnd w:id="64"/>
     </w:p>
     <w:p>
       <w:pPr>
@@ -9209,10 +9643,10 @@
       </w:pPr>
       <w:r>
         <w:object w:dxaOrig="14182" w:dyaOrig="14172" w14:anchorId="2036ACE1">
-          <v:shape id="_x0000_i1040" type="#_x0000_t75" style="width:457.5pt;height:458pt" o:ole="">
-            <v:imagedata r:id="rId55" o:title=""/>
+          <v:shape id="_x0000_i1104" type="#_x0000_t75" style="width:457.5pt;height:458pt" o:ole="">
+            <v:imagedata r:id="rId57" o:title=""/>
           </v:shape>
-          <o:OLEObject Type="Link" ProgID="Word.Document.12" ShapeID="_x0000_i1040" DrawAspect="Content" r:id="rId56" UpdateMode="Always">
+          <o:OLEObject Type="Link" ProgID="Word.Document.12" ShapeID="_x0000_i1104" DrawAspect="Content" r:id="rId58" UpdateMode="Always">
             <o:LinkType>EnhancedMetaFile</o:LinkType>
             <o:LockedField>false</o:LockedField>
             <o:FieldCodes>\f 0</o:FieldCodes>
@@ -9231,10 +9665,52 @@
         </w:sectPr>
       </w:pPr>
     </w:p>
-    <w:p>
-      <w:pPr>
+    <w:bookmarkStart w:id="65" w:name="_Ref156843762"/>
+    <w:p>
+      <w:pPr>
+        <w:pStyle w:val="Descripcin"/>
         <w:keepNext/>
       </w:pPr>
+      <w:r>
+        <w:lastRenderedPageBreak/>
+        <w:fldChar w:fldCharType="begin"/>
+      </w:r>
+      <w:r>
+        <w:instrText xml:space="preserve"> SEQ Annex \* ARABIC </w:instrText>
+      </w:r>
+      <w:r>
+        <w:fldChar w:fldCharType="separate"/>
+      </w:r>
+      <w:r>
+        <w:rPr>
+          <w:noProof/>
+        </w:rPr>
+        <w:t>3</w:t>
+      </w:r>
+      <w:r>
+        <w:fldChar w:fldCharType="end"/>
+      </w:r>
+      <w:r>
+        <w:t>. Annex: SDG alignment evaluation</w:t>
+      </w:r>
+      <w:bookmarkEnd w:id="65"/>
+    </w:p>
+    <w:p>
+      <w:pPr>
+        <w:keepNext/>
+      </w:pPr>
+      <w:r>
+        <w:object w:dxaOrig="5950" w:dyaOrig="8420" w14:anchorId="35508467">
+          <v:shape id="_x0000_i1033" type="#_x0000_t75" style="width:446.5pt;height:632pt" o:ole="">
+            <v:imagedata r:id="rId59" o:title=""/>
+          </v:shape>
+          <o:OLEObject Type="Link" ProgID="Acrobat.Document.DC" ShapeID="_x0000_i1033" DrawAspect="Content" r:id="rId60" UpdateMode="Always">
+            <o:LinkType>EnhancedMetaFile</o:LinkType>
+            <o:LockedField>false</o:LockedField>
+            <o:FieldCodes>\f 0</o:FieldCodes>
+          </o:OLEObject>
+        </w:object>
+      </w:r>
     </w:p>
     <w:sectPr>
       <w:pgSz w:w="11906" w:h="16838"/>
@@ -9761,21 +10237,11 @@
         <w:pPr>
           <w:pStyle w:val="Sinespaciado"/>
         </w:pPr>
-        <w:r>
-          <w:fldChar w:fldCharType="begin"/>
-        </w:r>
-        <w:r>
-          <w:instrText xml:space="preserve"> STYLEREF  Título  \* MERGEFORMAT </w:instrText>
-        </w:r>
-        <w:r>
-          <w:fldChar w:fldCharType="separate"/>
-        </w:r>
-        <w:r>
-          <w:t>Trade Hunter</w:t>
-        </w:r>
-        <w:r>
-          <w:fldChar w:fldCharType="end"/>
-        </w:r>
+        <w:fldSimple w:instr=" STYLEREF  Título  \* MERGEFORMAT ">
+          <w:r>
+            <w:t>Trade Hunter</w:t>
+          </w:r>
+        </w:fldSimple>
       </w:p>
     </w:sdtContent>
   </w:sdt>
@@ -11001,7 +11467,7 @@
         <w:szCs w:val="18"/>
         <w:lang w:val="es-ES" w:eastAsia="es-ES"/>
       </w:rPr>
-      <w:t>2</w:t>
+      <w:t>3</w:t>
     </w:r>
     <w:r>
       <w:rPr>
@@ -11056,7 +11522,7 @@
         <w:szCs w:val="18"/>
         <w:lang w:val="es-ES" w:eastAsia="es-ES"/>
       </w:rPr>
-      <w:t>Planification</w:t>
+      <w:t>Development</w:t>
     </w:r>
     <w:r>
       <w:rPr>

</xml_diff>

<commit_message>
Web page finished. The simulation is correct
</commit_message>
<xml_diff>
--- a/07_Final_deliveries/Report/Report - Trade Hunter.docx
+++ b/07_Final_deliveries/Report/Report - Trade Hunter.docx
@@ -74,7 +74,7 @@
         <mc:AlternateContent>
           <mc:Choice Requires="wpg">
             <w:drawing>
-              <wp:anchor distT="0" distB="0" distL="114300" distR="114300" simplePos="0" relativeHeight="251659264" behindDoc="0" locked="0" layoutInCell="1" allowOverlap="1" wp14:anchorId="1E2ABBB2" wp14:editId="1FC50EC4">
+              <wp:anchor distT="0" distB="0" distL="114300" distR="114300" simplePos="0" relativeHeight="251659264" behindDoc="0" locked="0" layoutInCell="1" allowOverlap="1" wp14:anchorId="1E2ABBB2" wp14:editId="3979BFC2">
                 <wp:simplePos x="0" y="0"/>
                 <wp:positionH relativeFrom="column">
                   <wp:posOffset>-1714500</wp:posOffset>
@@ -5750,7 +5750,7 @@
         </w:rPr>
         <w:lastRenderedPageBreak/>
         <w:drawing>
-          <wp:inline distT="0" distB="0" distL="0" distR="0" wp14:anchorId="0CA512F2" wp14:editId="09FBE677">
+          <wp:inline distT="0" distB="0" distL="0" distR="0" wp14:anchorId="0CA512F2" wp14:editId="260F7149">
             <wp:extent cx="5731510" cy="2495550"/>
             <wp:effectExtent l="0" t="0" r="2540" b="0"/>
             <wp:docPr id="1259540523" name="Imagen 1" descr="Escala de tiempo&#10;&#10;Descripción generada automáticamente"/>
@@ -6326,6 +6326,7 @@
       <w:r>
         <w:rPr>
           <w:rFonts w:cs="Arial"/>
+          <w:noProof/>
           <w:color w:val="000000"/>
           <w:bdr w:val="none" w:sz="0" w:space="0" w:color="auto" w:frame="1"/>
         </w:rPr>
@@ -6578,7 +6579,7 @@
           <w:bdr w:val="none" w:sz="0" w:space="0" w:color="auto" w:frame="1"/>
         </w:rPr>
         <w:drawing>
-          <wp:inline distT="0" distB="0" distL="0" distR="0" wp14:anchorId="21316F49" wp14:editId="16E929F9">
+          <wp:inline distT="0" distB="0" distL="0" distR="0" wp14:anchorId="21316F49" wp14:editId="0BAA79CD">
             <wp:extent cx="5704417" cy="889000"/>
             <wp:effectExtent l="0" t="0" r="0" b="6350"/>
             <wp:docPr id="342436630" name="Imagen 2" descr="Interfaz de usuario gráfica, Aplicación&#10;&#10;Descripción generada automáticamente"/>
@@ -6924,7 +6925,7 @@
         </w:rPr>
         <w:lastRenderedPageBreak/>
         <w:drawing>
-          <wp:inline distT="0" distB="0" distL="0" distR="0" wp14:anchorId="006574C9" wp14:editId="4B79B387">
+          <wp:inline distT="0" distB="0" distL="0" distR="0" wp14:anchorId="006574C9" wp14:editId="49D857BB">
             <wp:extent cx="5731510" cy="2859405"/>
             <wp:effectExtent l="0" t="0" r="2540" b="0"/>
             <wp:docPr id="964188130" name="Imagen 8" descr="Gráfico&#10;&#10;Descripción generada automáticamente"/>
@@ -7867,7 +7868,7 @@
           <w:bdr w:val="none" w:sz="0" w:space="0" w:color="auto" w:frame="1"/>
         </w:rPr>
         <w:drawing>
-          <wp:inline distT="0" distB="0" distL="0" distR="0" wp14:anchorId="56C762D8" wp14:editId="7F71CAB0">
+          <wp:inline distT="0" distB="0" distL="0" distR="0" wp14:anchorId="56C762D8" wp14:editId="358BA8D2">
             <wp:extent cx="5706743" cy="2425700"/>
             <wp:effectExtent l="0" t="0" r="8890" b="0"/>
             <wp:docPr id="2006212033" name="Imagen 1" descr="Gráfico, Gráfico de líneas&#10;&#10;Descripción generada automáticamente"/>
@@ -8148,7 +8149,7 @@
         </w:rPr>
         <w:lastRenderedPageBreak/>
         <w:drawing>
-          <wp:inline distT="0" distB="0" distL="0" distR="0" wp14:anchorId="02EB0A68" wp14:editId="4609C25A">
+          <wp:inline distT="0" distB="0" distL="0" distR="0" wp14:anchorId="02EB0A68" wp14:editId="33433D19">
             <wp:extent cx="5731510" cy="2697480"/>
             <wp:effectExtent l="0" t="0" r="2540" b="7620"/>
             <wp:docPr id="1260576549" name="Imagen 1" descr="Escala de tiempo&#10;&#10;Descripción generada automáticamente"/>
@@ -9577,15 +9578,62 @@
             <v:path o:extrusionok="f" gradientshapeok="t" o:connecttype="rect"/>
             <o:lock v:ext="edit" aspectratio="t"/>
           </v:shapetype>
-          <v:shape id="_x0000_i1043" type="#_x0000_t75" style="width:453pt;height:453pt" o:ole="">
+          <v:shape id="_x0000_i1025" type="#_x0000_t75" style="width:453pt;height:453pt" o:ole="">
             <v:imagedata r:id="rId55" o:title=""/>
           </v:shape>
-          <o:OLEObject Type="Link" ProgID="Word.Document.12" ShapeID="_x0000_i1043" DrawAspect="Content" r:id="rId56" UpdateMode="Always">
+          <o:OLEObject Type="Link" ProgID="Word.Document.12" ShapeID="_x0000_i1025" DrawAspect="Content" r:id="rId56" UpdateMode="Always">
             <o:LinkType>EnhancedMetaFile</o:LinkType>
             <o:LockedField>false</o:LockedField>
             <o:FieldCodes>\f 0</o:FieldCodes>
           </o:OLEObject>
         </w:object>
+      </w:r>
+    </w:p>
+    <w:p>
+      <w:pPr>
+        <w:pStyle w:val="Descripcin"/>
+      </w:pPr>
+      <w:r>
+        <w:fldChar w:fldCharType="begin"/>
+      </w:r>
+      <w:r>
+        <w:instrText xml:space="preserve"> STYLEREF 1 \s </w:instrText>
+      </w:r>
+      <w:r>
+        <w:fldChar w:fldCharType="separate"/>
+      </w:r>
+      <w:r>
+        <w:rPr>
+          <w:noProof/>
+        </w:rPr>
+        <w:t>7</w:t>
+      </w:r>
+      <w:r>
+        <w:fldChar w:fldCharType="end"/>
+      </w:r>
+      <w:r>
+        <w:t>-</w:t>
+      </w:r>
+      <w:r>
+        <w:fldChar w:fldCharType="begin"/>
+      </w:r>
+      <w:r>
+        <w:instrText xml:space="preserve"> SEQ Irudia \* ARABIC \s 1 </w:instrText>
+      </w:r>
+      <w:r>
+        <w:fldChar w:fldCharType="separate"/>
+      </w:r>
+      <w:r>
+        <w:rPr>
+          <w:noProof/>
+        </w:rPr>
+        <w:t>1</w:t>
+      </w:r>
+      <w:r>
+        <w:fldChar w:fldCharType="end"/>
+      </w:r>
+      <w:r>
+        <w:t>. Irudia</w:t>
       </w:r>
     </w:p>
     <w:p>
@@ -9638,15 +9686,62 @@
       </w:pPr>
       <w:r>
         <w:object w:dxaOrig="14182" w:dyaOrig="14172" w14:anchorId="2036ACE1">
-          <v:shape id="_x0000_i1033" type="#_x0000_t75" style="width:457.5pt;height:458pt" o:ole="">
+          <v:shape id="_x0000_i1030" type="#_x0000_t75" style="width:457.5pt;height:458pt" o:ole="">
             <v:imagedata r:id="rId58" o:title=""/>
           </v:shape>
-          <o:OLEObject Type="Link" ProgID="Word.Document.12" ShapeID="_x0000_i1033" DrawAspect="Content" r:id="rId59" UpdateMode="Always">
+          <o:OLEObject Type="Link" ProgID="Word.Document.12" ShapeID="_x0000_i1030" DrawAspect="Content" r:id="rId59" UpdateMode="Always">
             <o:LinkType>EnhancedMetaFile</o:LinkType>
             <o:LockedField>false</o:LockedField>
             <o:FieldCodes>\f 0</o:FieldCodes>
           </o:OLEObject>
         </w:object>
+      </w:r>
+    </w:p>
+    <w:p>
+      <w:pPr>
+        <w:pStyle w:val="Descripcin"/>
+      </w:pPr>
+      <w:r>
+        <w:fldChar w:fldCharType="begin"/>
+      </w:r>
+      <w:r>
+        <w:instrText xml:space="preserve"> STYLEREF 1 \s </w:instrText>
+      </w:r>
+      <w:r>
+        <w:fldChar w:fldCharType="separate"/>
+      </w:r>
+      <w:r>
+        <w:rPr>
+          <w:noProof/>
+        </w:rPr>
+        <w:t>7</w:t>
+      </w:r>
+      <w:r>
+        <w:fldChar w:fldCharType="end"/>
+      </w:r>
+      <w:r>
+        <w:t>-</w:t>
+      </w:r>
+      <w:r>
+        <w:fldChar w:fldCharType="begin"/>
+      </w:r>
+      <w:r>
+        <w:instrText xml:space="preserve"> SEQ Irudia \* ARABIC \s 1 </w:instrText>
+      </w:r>
+      <w:r>
+        <w:fldChar w:fldCharType="separate"/>
+      </w:r>
+      <w:r>
+        <w:rPr>
+          <w:noProof/>
+        </w:rPr>
+        <w:t>2</w:t>
+      </w:r>
+      <w:r>
+        <w:fldChar w:fldCharType="end"/>
+      </w:r>
+      <w:r>
+        <w:t>. Irudia</w:t>
       </w:r>
     </w:p>
     <w:p>
@@ -11462,7 +11557,7 @@
         <w:szCs w:val="18"/>
         <w:lang w:val="es-ES" w:eastAsia="es-ES"/>
       </w:rPr>
-      <w:t>7</w:t>
+      <w:t>3</w:t>
     </w:r>
     <w:r>
       <w:rPr>
@@ -11517,7 +11612,7 @@
         <w:szCs w:val="18"/>
         <w:lang w:val="es-ES" w:eastAsia="es-ES"/>
       </w:rPr>
-      <w:t>Annexes</w:t>
+      <w:t>Development</w:t>
     </w:r>
     <w:r>
       <w:rPr>

</xml_diff>